<commit_message>
added web references in subchapters 2.1 2.2 2.3
</commit_message>
<xml_diff>
--- a/Disertatie_NAD.docx
+++ b/Disertatie_NAD.docx
@@ -52,7 +52,7 @@
                   <v:path o:extrusionok="f" gradientshapeok="t" o:connecttype="rect"/>
                   <o:lock v:ext="edit" aspectratio="t"/>
                 </v:shapetype>
-                <v:shape id="Picture 3" o:spid="_x0000_i1033" type="#_x0000_t75" alt="" style="width:56pt;height:65pt;visibility:visible;mso-width-percent:0;mso-height-percent:0;mso-width-percent:0;mso-height-percent:0">
+                <v:shape id="Picture 3" o:spid="_x0000_i1025" type="#_x0000_t75" alt="" style="width:56.25pt;height:65.25pt;visibility:visible;mso-width-percent:0;mso-height-percent:0;mso-width-percent:0;mso-height-percent:0">
                   <v:imagedata r:id="rId8" o:title=""/>
                 </v:shape>
               </w:pict>
@@ -140,7 +140,7 @@
                 <w:noProof/>
               </w:rPr>
               <w:pict w14:anchorId="342D8C71">
-                <v:shape id="Picture 1" o:spid="_x0000_i1032" type="#_x0000_t75" alt="" style="width:65pt;height:66pt;visibility:visible;mso-width-percent:0;mso-height-percent:0;mso-width-percent:0;mso-height-percent:0">
+                <v:shape id="Picture 1" o:spid="_x0000_i1026" type="#_x0000_t75" alt="" style="width:65.25pt;height:66pt;visibility:visible;mso-width-percent:0;mso-height-percent:0;mso-width-percent:0;mso-height-percent:0">
                   <v:imagedata r:id="rId9" o:title=""/>
                 </v:shape>
               </w:pict>
@@ -377,9 +377,8 @@
           <w:szCs w:val="24"/>
         </w:rPr>
         <w:sectPr>
-          <w:footerReference w:type="even" r:id="rId10"/>
-          <w:footerReference w:type="default" r:id="rId11"/>
-          <w:footerReference w:type="first" r:id="rId12"/>
+          <w:footerReference w:type="default" r:id="rId10"/>
+          <w:footerReference w:type="first" r:id="rId11"/>
           <w:pgSz w:w="11907" w:h="16839" w:code="9"/>
           <w:pgMar w:top="1440" w:right="1440" w:bottom="1440" w:left="1440" w:header="720" w:footer="720" w:gutter="0"/>
           <w:pgNumType w:fmt="lowerRoman" w:start="1"/>
@@ -456,7 +455,7 @@
                 <w:noProof/>
               </w:rPr>
               <w:pict w14:anchorId="7DEEB7DE">
-                <v:shape id="_x0000_i1031" type="#_x0000_t75" alt="" style="width:56pt;height:65pt;visibility:visible;mso-width-percent:0;mso-height-percent:0;mso-width-percent:0;mso-height-percent:0">
+                <v:shape id="_x0000_i1027" type="#_x0000_t75" alt="" style="width:56.25pt;height:65.25pt;visibility:visible;mso-width-percent:0;mso-height-percent:0;mso-width-percent:0;mso-height-percent:0">
                   <v:imagedata r:id="rId8" o:title=""/>
                 </v:shape>
               </w:pict>
@@ -544,7 +543,7 @@
                 <w:noProof/>
               </w:rPr>
               <w:pict w14:anchorId="52303D7B">
-                <v:shape id="_x0000_i1030" type="#_x0000_t75" alt="" style="width:65pt;height:66pt;visibility:visible;mso-width-percent:0;mso-height-percent:0;mso-width-percent:0;mso-height-percent:0">
+                <v:shape id="_x0000_i1028" type="#_x0000_t75" alt="" style="width:65.25pt;height:66pt;visibility:visible;mso-width-percent:0;mso-height-percent:0;mso-width-percent:0;mso-height-percent:0">
                   <v:imagedata r:id="rId9" o:title=""/>
                 </v:shape>
               </w:pict>
@@ -2288,7 +2287,7 @@
                 <w:noProof/>
               </w:rPr>
               <w:pict w14:anchorId="46016723">
-                <v:shape id="Picture 7" o:spid="_x0000_i1028" type="#_x0000_t75" alt="" style="width:51pt;height:51pt;visibility:visible;mso-width-percent:0;mso-height-percent:0;mso-width-percent:0;mso-height-percent:0">
+                <v:shape id="Picture 7" o:spid="_x0000_i1030" type="#_x0000_t75" alt="" style="width:51pt;height:51pt;visibility:visible;mso-width-percent:0;mso-height-percent:0;mso-width-percent:0;mso-height-percent:0">
                   <v:imagedata r:id="rId9" o:title=""/>
                 </v:shape>
               </w:pict>
@@ -9335,7 +9334,7 @@
       <w:pPr>
         <w:jc w:val="both"/>
         <w:sectPr>
-          <w:headerReference w:type="first" r:id="rId13"/>
+          <w:headerReference w:type="first" r:id="rId12"/>
           <w:pgSz w:w="11907" w:h="16839" w:code="9"/>
           <w:pgMar w:top="1440" w:right="1440" w:bottom="1440" w:left="1440" w:header="720" w:footer="720" w:gutter="0"/>
           <w:pgNumType w:fmt="lowerRoman" w:start="1"/>
@@ -9380,325 +9379,537 @@
       </w:pPr>
       <w:bookmarkStart w:id="0" w:name="_Toc226026622"/>
       <w:r>
+        <w:t>Introducere</w:t>
+      </w:r>
+      <w:bookmarkEnd w:id="0"/>
+    </w:p>
+    <w:p>
+      <w:pPr>
+        <w:pStyle w:val="Heading2"/>
+      </w:pPr>
+      <w:bookmarkStart w:id="1" w:name="_Toc226026623"/>
+      <w:r>
+        <w:t>Scopul</w:t>
+      </w:r>
+      <w:bookmarkEnd w:id="1"/>
+    </w:p>
+    <w:p>
+      <w:pPr>
+        <w:jc w:val="both"/>
+      </w:pPr>
+      <w:r>
+        <w:t xml:space="preserve">Primul capitol al lucrării este </w:t>
+      </w:r>
+      <w:r>
+        <w:t>bineînțeles</w:t>
+      </w:r>
+      <w:r>
+        <w:t xml:space="preserve"> cel de introducere </w:t>
+      </w:r>
+      <w:r>
+        <w:t xml:space="preserve">a cititorului în tema lucrării </w:t>
+      </w:r>
+      <w:r>
+        <w:t xml:space="preserve">… </w:t>
+      </w:r>
+      <w:r>
+        <w:t xml:space="preserve"> De exemplu, acest document a fost creat cu scopul de a ajuta studenții Facultății de Automatică, Calculatoare și Electronică să își redacteze propri</w:t>
+      </w:r>
+      <w:r>
+        <w:t>ul proiect de diplomă</w:t>
+      </w:r>
+      <w:r>
+        <w:t>.</w:t>
+      </w:r>
+      <w:r>
+        <w:t xml:space="preserve"> Acest șablon poate fi folosit de oricine respectând principiile declarate în </w:t>
+      </w:r>
+      <w:r>
+        <w:t>Capitol</w:t>
+      </w:r>
+      <w:r>
+        <w:t>e</w:t>
+      </w:r>
+      <w:r>
+        <w:t>l</w:t>
+      </w:r>
+      <w:r>
+        <w:t xml:space="preserve">e </w:t>
+      </w:r>
+      <w:r>
+        <w:fldChar w:fldCharType="begin"/>
+      </w:r>
+      <w:r>
+        <w:instrText xml:space="preserve"> REF _Ref226023022 \r \h </w:instrText>
+      </w:r>
+      <w:r>
+        <w:fldChar w:fldCharType="separate"/>
+      </w:r>
+      <w:r>
+        <w:t>2</w:t>
+      </w:r>
+      <w:r>
+        <w:fldChar w:fldCharType="end"/>
+      </w:r>
+      <w:r>
+        <w:t xml:space="preserve">, </w:t>
+      </w:r>
+      <w:r>
+        <w:fldChar w:fldCharType="begin"/>
+      </w:r>
+      <w:r>
+        <w:instrText xml:space="preserve"> REF _Ref309844154 \r \h </w:instrText>
+      </w:r>
+      <w:r>
+        <w:fldChar w:fldCharType="separate"/>
+      </w:r>
+      <w:r>
+        <w:t>3</w:t>
+      </w:r>
+      <w:r>
+        <w:fldChar w:fldCharType="end"/>
+      </w:r>
+      <w:r>
+        <w:t xml:space="preserve"> și </w:t>
+      </w:r>
+      <w:r>
+        <w:fldChar w:fldCharType="begin"/>
+      </w:r>
+      <w:r>
+        <w:instrText xml:space="preserve"> REF _Ref226023042 \r \h </w:instrText>
+      </w:r>
+      <w:r>
+        <w:fldChar w:fldCharType="separate"/>
+      </w:r>
+      <w:r>
+        <w:t>4</w:t>
+      </w:r>
+      <w:r>
+        <w:fldChar w:fldCharType="end"/>
+      </w:r>
+      <w:r>
+        <w:t xml:space="preserve">. </w:t>
+      </w:r>
+    </w:p>
+    <w:p>
+      <w:pPr>
+        <w:pStyle w:val="Heading2"/>
+      </w:pPr>
+      <w:bookmarkStart w:id="2" w:name="_Toc226026624"/>
+      <w:r>
+        <w:t>Motivația</w:t>
+      </w:r>
+      <w:bookmarkEnd w:id="2"/>
+    </w:p>
+    <w:p>
+      <w:r>
+        <w:t>Autorul justifică aici alegerea și interesul său pentru tema aleasă.</w:t>
+      </w:r>
+    </w:p>
+    <w:p>
+      <w:pPr>
+        <w:pStyle w:val="Heading2"/>
+      </w:pPr>
+      <w:bookmarkStart w:id="3" w:name="_Toc226026625"/>
+      <w:r>
+        <w:t>Contextul actual</w:t>
+      </w:r>
+      <w:bookmarkEnd w:id="3"/>
+    </w:p>
+    <w:p>
+      <w:r>
+        <w:t>Autorul face o prezentare generală și dă o justificare în direcția temei alese din perspectiva contextului actual.</w:t>
+      </w:r>
+    </w:p>
+    <w:p>
+      <w:pPr>
+        <w:pStyle w:val="Heading1"/>
+      </w:pPr>
+      <w:r>
+        <w:t>LITERATURE REVIEW AND ECONOMIC FOUNDATONS</w:t>
+      </w:r>
+    </w:p>
+    <w:p>
+      <w:pPr>
+        <w:pStyle w:val="Heading2"/>
+      </w:pPr>
+      <w:r>
+        <w:t>The Efficient Market Hypothesis (EMH) and the Random Walk Theory</w:t>
+      </w:r>
+    </w:p>
+    <w:p/>
+    <w:p>
+      <w:r>
+        <w:t>For decades, classical financial economics and digital market valuation models have been heavily anchored to the Efficient Market Hypothesis (EMH)</w:t>
+      </w:r>
+      <w:r>
+        <w:t xml:space="preserve">. </w:t>
+      </w:r>
+      <w:r>
+        <w:t>The core tenet of this framework posits that competitive electronic market forces ensure that all publicly available information, historical indicators, and corporate data are instantly and fully reflected in an asset's current market capitalization</w:t>
+      </w:r>
+      <w:r>
+        <w:rPr>
+          <w:rStyle w:val="EndnoteReference"/>
+        </w:rPr>
+        <w:endnoteReference w:id="1"/>
+      </w:r>
+      <w:r>
+        <w:t>. Within a perfectly efficient marketplace, security prices adapt exclusively to entirely novel information or unanticipated operational shocks. Because news is by definition unpredictable and randomly distributed over time, the resulting chronological adjustments of asset prices must behave as a purely stochastic sequence—conceptually structured as a random walk</w:t>
+      </w:r>
+      <w:bookmarkStart w:id="4" w:name="_Ref231817775"/>
+      <w:r>
+        <w:rPr>
+          <w:rStyle w:val="EndnoteReference"/>
+        </w:rPr>
+        <w:endnoteReference w:id="2"/>
+      </w:r>
+      <w:bookmarkEnd w:id="4"/>
+      <w:r>
+        <w:t>.</w:t>
+      </w:r>
+    </w:p>
+    <w:p>
+      <w:r>
+        <w:t>According to traditional interpretations, any systematic attempt to parse historical sequences, discover repetitive cyclical structures, or deploy automated mechanisms to consistently achieve risk-adjusted returns superior to the broader market index is fundamentally futile</w:t>
+      </w:r>
+      <w:r>
+        <w:t xml:space="preserve">. </w:t>
+      </w:r>
+      <w:r>
+        <w:t xml:space="preserve">Linear statistical frameworks, </w:t>
+      </w:r>
+      <w:r>
         <w:lastRenderedPageBreak/>
-        <w:t>Introducere</w:t>
-      </w:r>
-      <w:bookmarkEnd w:id="0"/>
-    </w:p>
+        <w:t>including Autoregressive Integrated Moving Average (ARIMA) models, were designed around these assumptions to capture localized variance rather than predictive directional shifts. However, within contemporary enterprise information systems, these deterministic linear models face massive empirical challenges due to their inability to accommodate the adaptive, highly complex behavioral realities of modern electronic execution environments</w:t>
+      </w:r>
+      <w:r>
+        <w:rPr>
+          <w:rStyle w:val="EndnoteReference"/>
+        </w:rPr>
+        <w:endnoteReference w:id="3"/>
+      </w:r>
+      <w:r>
+        <w:t>.</w:t>
+      </w:r>
+    </w:p>
+    <w:p/>
+    <w:p>
+      <w:r>
+        <w:t>Figure 2.1</w:t>
+      </w:r>
+      <w:r>
+        <w:t>. Structural Breakdown of Information Processing: Efficient Market Hypothesis (EMH) vs. Adaptive Non-Linear Systems.</w:t>
+      </w:r>
+    </w:p>
+    <w:p/>
     <w:p>
       <w:pPr>
         <w:pStyle w:val="Heading2"/>
       </w:pPr>
-      <w:bookmarkStart w:id="1" w:name="_Toc226026623"/>
-      <w:r>
-        <w:t>Scopul</w:t>
-      </w:r>
-      <w:bookmarkEnd w:id="1"/>
-    </w:p>
-    <w:p>
-      <w:pPr>
-        <w:jc w:val="both"/>
-      </w:pPr>
-      <w:r>
-        <w:t xml:space="preserve">Primul capitol al lucrării este </w:t>
-      </w:r>
-      <w:r>
-        <w:t>bineînțeles</w:t>
-      </w:r>
-      <w:r>
-        <w:t xml:space="preserve"> cel de introducere </w:t>
-      </w:r>
-      <w:r>
-        <w:t xml:space="preserve">a cititorului în tema lucrării </w:t>
-      </w:r>
-      <w:r>
-        <w:t xml:space="preserve">… </w:t>
-      </w:r>
-      <w:r>
-        <w:t xml:space="preserve"> De exemplu, acest document a fost creat cu scopul de a ajuta studenții Facultății de Automatică, Calculatoare și Electronică să își redacteze propri</w:t>
-      </w:r>
-      <w:r>
-        <w:t>ul proiect de diplomă</w:t>
+      <w:r>
+        <w:t>Micro-structural Inefficiencies and Digital Trading Ecosystems</w:t>
+      </w:r>
+    </w:p>
+    <w:p/>
+    <w:p>
+      <w:r>
+        <w:t>The rapid digitalization of commercial transactions, coupled with the emergence of advanced algorithmic execution desks, has fundamentally decoupled current financial environments from the idealistic, frictionless assumptions of 20th-century economic theory. Modern digital business ecosystems generate continuous, multi-dimensional data arrays characterized by intense architectural dependencies, non-Gaussian noise distributions, and structural memory vectors that directly invalidate memoryless constraints.</w:t>
+      </w:r>
+      <w:r>
+        <w:rPr>
+          <w:vertAlign w:val="superscript"/>
+        </w:rPr>
+        <w:fldChar w:fldCharType="begin"/>
+      </w:r>
+      <w:r>
+        <w:rPr>
+          <w:vertAlign w:val="superscript"/>
+        </w:rPr>
+        <w:instrText xml:space="preserve"> NOTEREF _Ref231817775 \h </w:instrText>
+      </w:r>
+      <w:r>
+        <w:rPr>
+          <w:vertAlign w:val="superscript"/>
+        </w:rPr>
+      </w:r>
+      <w:r>
+        <w:rPr>
+          <w:vertAlign w:val="superscript"/>
+        </w:rPr>
+        <w:instrText xml:space="preserve"> \* MERGEFORMAT </w:instrText>
+      </w:r>
+      <w:r>
+        <w:rPr>
+          <w:vertAlign w:val="superscript"/>
+        </w:rPr>
+        <w:fldChar w:fldCharType="separate"/>
+      </w:r>
+      <w:r>
+        <w:rPr>
+          <w:vertAlign w:val="superscript"/>
+        </w:rPr>
+        <w:t>2</w:t>
+      </w:r>
+      <w:r>
+        <w:rPr>
+          <w:vertAlign w:val="superscript"/>
+        </w:rPr>
+        <w:fldChar w:fldCharType="end"/>
+      </w:r>
+      <w:r>
+        <w:t xml:space="preserve"> Empirical tracking of electronic order books indicates that information propagation behaves as a highly non-linear diffusion process passing through localized technology pipelines</w:t>
       </w:r>
       <w:r>
         <w:t>.</w:t>
       </w:r>
       <w:r>
-        <w:t xml:space="preserve"> Acest șablon poate fi folosit de oricine respectând principiile declarate în </w:t>
-      </w:r>
-      <w:r>
-        <w:t>Capitol</w:t>
-      </w:r>
-      <w:r>
-        <w:t>e</w:t>
-      </w:r>
-      <w:r>
-        <w:t>l</w:t>
-      </w:r>
-      <w:r>
-        <w:t xml:space="preserve">e </w:t>
-      </w:r>
-      <w:r>
+        <w:rPr>
+          <w:rStyle w:val="EndnoteReference"/>
+        </w:rPr>
+        <w:endnoteReference w:id="4"/>
+      </w:r>
+    </w:p>
+    <w:p>
+      <w:r>
+        <w:t>Furthermore, the integration of quantitative asset management with advanced computational infrastructures has introduced complex feedback mechanisms, including institutional momentum trading, cascading stop-loss liquidations, and high-frequency trading (HFT) structural imbalances. These phenomena generate persistent multi-day micro-structural patterns, localized structural trends, and recurring temporal anomalies that are deeply non-linear in nature. While these hidden patterns look like chaotic white noise when processed through traditional linear statistical regressions, they present rich, exploitable structural dependencies when examined through multi-layered deep learning topologies</w:t>
+      </w:r>
+      <w:r>
+        <w:t>.</w:t>
+      </w:r>
+      <w:r>
+        <w:t xml:space="preserve"> </w:t>
+      </w:r>
+      <w:r>
+        <w:t>By framing financial prediction as a non-linear information-processing task, modern enterprise information systems can deploy recurrent networks to map complex multi-variable feature vectors</w:t>
+      </w:r>
+      <w:r>
+        <w:t>.</w:t>
+      </w:r>
+      <w:r>
+        <w:rPr>
+          <w:rStyle w:val="EndnoteReference"/>
+        </w:rPr>
+        <w:endnoteReference w:id="5"/>
+      </w:r>
+    </w:p>
+    <w:p/>
+    <w:p>
+      <w:pPr>
+        <w:pStyle w:val="Heading2"/>
+      </w:pPr>
+      <w:r>
+        <w:lastRenderedPageBreak/>
+        <w:t>Web Architectures, Frameworks, and Data Ingestion Standards</w:t>
+      </w:r>
+    </w:p>
+    <w:p>
+      <w:r>
+        <w:t>The engineering and deployment of modern decision-support applications require strict adherence to web standards established by open software consortiums</w:t>
+      </w:r>
+      <w:r>
+        <w:t xml:space="preserve">. </w:t>
+      </w:r>
+      <w:r>
+        <w:t>In order to deliver high-frequency predictive analytics to enterprise stakeholders, contemporary e-business systems must decouple the resource-intensive computational core (the deep learning backend) from the lightweight client presentation layer</w:t>
+      </w:r>
+      <w:r>
+        <w:t xml:space="preserve">. </w:t>
+      </w:r>
+      <w:bookmarkStart w:id="5" w:name="_Ref231819263"/>
+      <w:r>
+        <w:rPr>
+          <w:rStyle w:val="EndnoteReference"/>
+        </w:rPr>
+        <w:endnoteReference w:id="6"/>
+      </w:r>
+      <w:bookmarkEnd w:id="5"/>
+      <w:r>
+        <w:t xml:space="preserve"> </w:t>
+      </w:r>
+      <w:r>
+        <w:t>Traditional Model-View-Controller (MVC) server-side rendering configurations introduce severe processing bottlenecks when handling real-time financial stream arrays.</w:t>
+      </w:r>
+    </w:p>
+    <w:p>
+      <w:pPr>
+        <w:rPr>
+          <w:vertAlign w:val="superscript"/>
+        </w:rPr>
+      </w:pPr>
+      <w:r>
+        <w:t>Consequently, modern architectures favor declarative, reactive web data state management layers</w:t>
+      </w:r>
+      <w:r>
+        <w:t xml:space="preserve">. </w:t>
+      </w:r>
+      <w:r>
+        <w:t>Financial feature tensors, ingested through encrypted transport protocols, are parsed dynamically to map programmatic arrays into unified schemas</w:t>
+      </w:r>
+      <w:r>
+        <w:t xml:space="preserve">. </w:t>
+      </w:r>
+      <w:r>
+        <w:rPr>
+          <w:rStyle w:val="EndnoteReference"/>
+        </w:rPr>
+        <w:endnoteReference w:id="7"/>
+      </w:r>
+      <w:r>
+        <w:t xml:space="preserve"> </w:t>
+      </w:r>
+      <w:r>
+        <w:t>By scaling independent software modules within sandboxed virtual execution environments, the enterprise system eliminates data corruption and guarantees cross-platform execution stability across distinct operating systems, such as UNIX-based environments</w:t>
+      </w:r>
+      <w:r>
+        <w:t xml:space="preserve">. </w:t>
+      </w:r>
+      <w:r>
+        <w:rPr>
+          <w:vertAlign w:val="superscript"/>
+        </w:rPr>
         <w:fldChar w:fldCharType="begin"/>
       </w:r>
       <w:r>
-        <w:instrText xml:space="preserve"> REF _Ref226023022 \r \h </w:instrText>
-      </w:r>
-      <w:r>
+        <w:rPr>
+          <w:vertAlign w:val="superscript"/>
+        </w:rPr>
+        <w:instrText xml:space="preserve"> NOTEREF _Ref231819263 \h </w:instrText>
+      </w:r>
+      <w:r>
+        <w:rPr>
+          <w:vertAlign w:val="superscript"/>
+        </w:rPr>
+      </w:r>
+      <w:r>
+        <w:rPr>
+          <w:vertAlign w:val="superscript"/>
+        </w:rPr>
+        <w:instrText xml:space="preserve"> \* MERGEFORMAT </w:instrText>
+      </w:r>
+      <w:r>
+        <w:rPr>
+          <w:vertAlign w:val="superscript"/>
+        </w:rPr>
         <w:fldChar w:fldCharType="separate"/>
       </w:r>
       <w:r>
-        <w:t>2</w:t>
-      </w:r>
-      <w:r>
+        <w:rPr>
+          <w:vertAlign w:val="superscript"/>
+        </w:rPr>
+        <w:t>6</w:t>
+      </w:r>
+      <w:r>
+        <w:rPr>
+          <w:vertAlign w:val="superscript"/>
+        </w:rPr>
         <w:fldChar w:fldCharType="end"/>
       </w:r>
-      <w:r>
-        <w:t xml:space="preserve">, </w:t>
-      </w:r>
-      <w:r>
-        <w:fldChar w:fldCharType="begin"/>
-      </w:r>
-      <w:r>
-        <w:instrText xml:space="preserve"> REF _Ref309844154 \r \h </w:instrText>
-      </w:r>
-      <w:r>
-        <w:fldChar w:fldCharType="separate"/>
-      </w:r>
-      <w:r>
-        <w:t>3</w:t>
-      </w:r>
-      <w:r>
-        <w:fldChar w:fldCharType="end"/>
-      </w:r>
-      <w:r>
-        <w:t xml:space="preserve"> și </w:t>
-      </w:r>
-      <w:r>
-        <w:fldChar w:fldCharType="begin"/>
-      </w:r>
-      <w:r>
-        <w:instrText xml:space="preserve"> REF _Ref226023042 \r \h </w:instrText>
-      </w:r>
-      <w:r>
-        <w:fldChar w:fldCharType="separate"/>
-      </w:r>
-      <w:r>
-        <w:t>4</w:t>
-      </w:r>
-      <w:r>
-        <w:fldChar w:fldCharType="end"/>
-      </w:r>
-      <w:r>
-        <w:t xml:space="preserve">. </w:t>
-      </w:r>
     </w:p>
     <w:p>
       <w:pPr>
         <w:pStyle w:val="Heading2"/>
       </w:pPr>
-      <w:bookmarkStart w:id="2" w:name="_Toc226026624"/>
-      <w:r>
-        <w:t>Motivația</w:t>
-      </w:r>
-      <w:bookmarkEnd w:id="2"/>
-    </w:p>
-    <w:p>
-      <w:r>
-        <w:t>Autorul justifică aici alegerea și interesul său pentru tema aleasă.</w:t>
-      </w:r>
-    </w:p>
+      <w:r>
+        <w:t>The Modern AI and Hardware Infrastructure Speculative Bubble (2023–2025)</w:t>
+      </w:r>
+    </w:p>
+    <w:p/>
+    <w:p>
+      <w:r>
+        <w:t xml:space="preserve">The chronological boundary established within this master's thesis fundamentally captures one of the most volatile, mathematically anomalous, and macroeconomically significant events in the history of global digital business frameworks: the explosive emergence and subsequent structural consolidation of the "Artificial Intelligence and Advanced Hardware Infrastructure Boom" [1] spanning the fiscal periods of 2023 through late 2025. Within the context of </w:t>
+      </w:r>
+      <w:r>
+        <w:t>Information Systems for e-Business</w:t>
+      </w:r>
+      <w:r>
+        <w:t>, this specific chronological epoch serves not merely as a temporal backdrop, but as an aggressive, high-volatility laboratory environment designed to stress-test the operational resilience of modern deep learning predictive algorithms.</w:t>
+      </w:r>
+      <w:r>
+        <w:t xml:space="preserve"> </w:t>
+      </w:r>
+    </w:p>
+    <w:p>
+      <w:r>
+        <w:t>Prior to this structural market shift, global financial asset pricing models operated under relatively predictable macro-regimes characterized by steady consumer technology cycles, institutional supply-chain normalizations following the pandemic disruptions of 2020, and predictable corporate credit structures managed by central banking interest rates. However, the introduction and rapid enterprise adoption of generative artificial intelligence architectures, large language models (LLMs), and hyper-scaled neural networks created an unprecedented, non-linear demand shock throughout the global technology ecosystem.</w:t>
+      </w:r>
+    </w:p>
+    <w:p/>
+    <w:p>
+      <w:r>
+        <w:t>Figure 2.2. Parabolic Trajectory of NVIDIA (NVDA) Market Capitalization vs. Industry Moving Averages During the 2023-2025 Hardware Supply Crunch.</w:t>
+      </w:r>
+    </w:p>
+    <w:p/>
+    <w:p>
+      <w:r>
+        <w:t xml:space="preserve">This structural shift completely redefined the valuation metrics of the global semiconductor, data center, and cloud computing markets. At the absolute epicenter of this macroeconomic expansion was NVIDIA Corporation (NVDA), an asset whose financial data series transitions from a standard high-growth technology equity into a highly parabolic, sentiment-driven speculative vehicle. During this intensive multi-year expansion, traditional financial indicators, standard moving averages, and classical autoregressive integrated moving average (ARIMA) statistical forecasting frameworks exhibited complete, systemic performance degradation. This absolute decay in classical predictive power occurred because the underlying asset price movements were no longer tightly coupled with historical valuation baselines, steady price-to-earnings metrics, or efficient informational distributions as hypothesized by the Efficient Market Hypothesis (EMH). Instead, market movements were governed by a hyper-complex confluence of behavioral market sentiment, institutional momentum trading, massive retail capital flows, and intense physical micro-structural constraints. </w:t>
+      </w:r>
+    </w:p>
+    <w:p>
+      <w:r>
+        <w:t>To comprehensively understand why deep recurrent networks like Long Short-Term Memory (LSTM) and Gated Recurrent Units (GRU) are required to model this specific market regime, the system must decompose the structural physics of the 2023–2025 AI bubble into separate, highly interactive corporate realities:</w:t>
+      </w:r>
+    </w:p>
+    <w:p>
+      <w:pPr>
+        <w:pStyle w:val="Heading3"/>
+      </w:pPr>
+      <w:r>
+        <w:t>The Micro-structural Semiconductor Supply Crunch</w:t>
+      </w:r>
+    </w:p>
+    <w:p/>
+    <w:p>
+      <w:r>
+        <w:t>Unlike historical digital asset expansions, such as the software-based dot-com bubble of the late 1990s, the artificial intelligence expansion was bound to absolute, physical manufacturing bottlenecks. Enterprise computing architectures required specialized graphics processing units (GPUs) capable of asynchronous tensor matrix multiplications. The extreme institutional rush to secure compute capacity resulted in severe supply constraints surrounding advanced semiconductor fabrications, silicon wafer allocations, and, critically, High Bandwidth Memory (HBM/VRAM) components.</w:t>
+      </w:r>
+    </w:p>
+    <w:p>
+      <w:r>
+        <w:t xml:space="preserve">Because corporate entities like NVIDIA maintained exclusive commercial control over the proprietary chip architectures and software ecosystems (such as the CUDA computing platform), their financial </w:t>
+      </w:r>
+      <w:r>
+        <w:lastRenderedPageBreak/>
+        <w:t>statements reflected astronomical, non-linear growth in net profit margins. When an information system attempts to model an asset bound to such intense, physical supply imbalances, standard closing price metrics fail to capture the underlying market tension. The volume distribution backing each transaction becomes the primary indicator of institutional accumulation. This reality justifies why this thesis rejects simple open/close scalar points in favor of a mathematically derived Volume Weighted Average Price (VWAP) engine, ensuring that periods of extreme supply shocks are properly scaled by transaction intensity before being introduced to the neural network’s weight matrices.</w:t>
+      </w:r>
+    </w:p>
+    <w:p/>
+    <w:p>
+      <w:pPr>
+        <w:pStyle w:val="Heading3"/>
+      </w:pPr>
+      <w:r>
+        <w:t>The Physics of Parabolic Momentum and Behavioral Speculation</w:t>
+      </w:r>
+    </w:p>
+    <w:p>
+      <w:r>
+        <w:t>During the height of the hardware boom, asset price behaviors exhibited extreme directional persistence, often referred to in quantitative finance as a heavy-tailed, non-Gaussian distribution. In standard linear economics, it is assumed that when an asset price rises significantly above its historical mean, profit-taking forces will immediately act as a negative feedback loop, pulling the price back toward equilibrium (mean reversion). However, during the 2023–2025 regime, the market architecture experienced a strong positive feedback loop.</w:t>
+      </w:r>
+    </w:p>
+    <w:p>
+      <w:r>
+        <w:t>As the valuation of AI infrastructure providers escalated, institutional momentum algorithms, quantitative trend-following index funds, and highly speculative retail traders continuously bought the asset, creating a self-reinforcing upward spiral. This parabolic behavior generates a major challenge for shallow neural configurations due to the presence of non-stationarity—a state where the statistical properties of the time series (mean, variance, and autocorrelation) continuously change over time. Under these conditions, classical models experience immediate "gradient explosions" or become completely desensitized to sudden trend reversals, whereas multi-layered deep learning systems utilizing specialized dropout regularizations ($\text{Dropout} = 0.2$) are specifically structured to prevent absolute overfitting during these localized speculatory waves.</w:t>
+      </w:r>
+    </w:p>
+    <w:p/>
     <w:p>
       <w:pPr>
         <w:pStyle w:val="Heading2"/>
       </w:pPr>
-      <w:bookmarkStart w:id="3" w:name="_Toc226026625"/>
-      <w:r>
-        <w:t>Contextul actual</w:t>
-      </w:r>
-      <w:bookmarkEnd w:id="3"/>
-    </w:p>
-    <w:p>
-      <w:r>
-        <w:t>Autorul face o prezentare generală și dă o justificare în direcția temei alese din perspectiva contextului actual.</w:t>
-      </w:r>
-    </w:p>
-    <w:p>
-      <w:pPr>
-        <w:pStyle w:val="Heading1"/>
-      </w:pPr>
-      <w:r>
-        <w:t>LITERATURE REVIEW AND ECONOMIC FOUNDATONS</w:t>
-      </w:r>
-    </w:p>
-    <w:p>
-      <w:pPr>
-        <w:pStyle w:val="Heading2"/>
-      </w:pPr>
-      <w:r>
-        <w:t>The Efficient Market Hypothesis (EMH) and the Random Walk Theory</w:t>
+      <w:r>
+        <w:t>The Traditional Financial Counterweight: Analyzing JPMorgan Chase (JPM)</w:t>
       </w:r>
     </w:p>
     <w:p/>
     <w:p>
       <w:r>
-        <w:t xml:space="preserve">For decades, classical financial economics and automated asset pricing models have been heavily anchored to the Efficient Market Hypothesis (EMH), a foundational theoretical framework formalised by Eugene Fama and later widely popularised for retail and institutional audiences by Burton Malkiel in his landmark literature, A Random Walk Down Wall Street. The core tenet of the EMH posits that modern financial asset markets operate under a regime of informational efficiency, where competitive market forces ensure that all publicly available information, historical macroeconomic indicators, and corporate financial data are instantly and fully reflected in the current market capitalization of any given equity asset. Consequently, within a perfectly efficient marketplace, security prices adapt exclusively to entirely novel information or unanticipated operational shocks. Because news is by definition inherently unpredictable and randomly distributed over time, the resulting chronological adjustments of asset prices must behave as a purely stochastic sequence—conceptually structured as a "random walk".  </w:t>
-      </w:r>
-    </w:p>
-    <w:p>
+        <w:t xml:space="preserve">To prevent the developed predictive framework from becoming overly specialized or structurally biased toward the hyper-volatile characteristics of the growth technology sector, this master’s thesis </w:t>
+      </w:r>
       <w:r>
         <w:lastRenderedPageBreak/>
-        <w:t xml:space="preserve">According to Malkiel’s strict classical interpretation, any systematic attempt to parse historical sequences, discover repetitive cyclical structures, or deploy autoregressive statistical mechanisms to consistently achieve risk-adjusted returns superior to the broader market index is fundamentally futile. This traditional perspective classifies price changes as memoryless processes where the probability distribution of future price vectors depends solely on the current state vector, satisfying the properties of a first-order Markov chain. Linear statistical frameworks, including Autoregressive Integrated Moving Average (ARIMA) models and basic generalized autoregressive conditional heteroskedasticity (GARCH) formulations, were designed around these assumptions to capture localized variance rather than predictive directional shifts.  </w:t>
-      </w:r>
-    </w:p>
-    <w:p>
-      <w:r>
-        <w:t xml:space="preserve">However, within contemporary Information Systems for e-Business frameworks, these deterministic linear models and their underlying random walk assumptions face massive conceptual and empirical challenges. The core limitation of classical financial models lies in their rigid insistence on structural linearity and their inability to accommodate the adaptive, highly complex behavioral realities of modern electronic execution environments.  </w:t>
-      </w:r>
-    </w:p>
-    <w:p>
-      <w:r>
-        <w:t>Figure 2.1</w:t>
-      </w:r>
-      <w:r>
-        <w:t xml:space="preserve">. </w:t>
-      </w:r>
-      <w:r>
-        <w:t>Structural Breakdown of Information Processing: Efficient Market Hypothesis (EMH) vs. Adaptive Non-Linear Systems.</w:t>
-      </w:r>
-    </w:p>
-    <w:p/>
-    <w:p>
-      <w:pPr>
-        <w:pStyle w:val="Heading2"/>
-      </w:pPr>
-      <w:r>
-        <w:t>Micro-structural Inefficiencies and Digital Trading Ecosystems</w:t>
-      </w:r>
-    </w:p>
-    <w:p/>
-    <w:p>
-      <w:r>
-        <w:t>T</w:t>
-      </w:r>
-      <w:r>
-        <w:t xml:space="preserve">he rapid digitalization of commercial transactions, coupled with the emergence of advanced algorithmic execution desks, has fundamentally decoupled current financial environments from the idealistic, frictionless assumptions of 20th-century economic theory. Modern digital business ecosystems generate continuous, multi-dimensional data arrays characterized by intense architectural dependencies, non-Gaussian noise distributions, and structural memory vectors that directly invalidate the memoryless constraints of the Random Walk Theory. Empirical tracking of electronic order books indicates that capital markets do not digest information instantaneously; instead, information propagation behaves as a highly non-linear diffusion process passing through localized technology pipelines.  Furthermore, the integration of quantitative asset management with advanced computational infrastructures has introduced complex feedback mechanisms, including institutional momentum trading, cascading stop-loss liquidations, and high-frequency trading (HFT) structural imbalances. These phenomena generate persistent multi-day micro-structural patterns, localized structural trends, and recurring temporal anomalies that are deeply non-linear in nature. While these </w:t>
-      </w:r>
-      <w:r>
-        <w:lastRenderedPageBreak/>
-        <w:t xml:space="preserve">hidden patterns look like chaotic white noise when processed through traditional linear statistical regressions, they present rich, exploitable structural dependencies when examined through multi-layered deep learning topologies.  </w:t>
-      </w:r>
-    </w:p>
-    <w:p>
-      <w:r>
-        <w:t>By framing financial prediction as a non-linear information-processing task, modern enterprise information systems can deploy recurrent networks to map complex multi-variable feature vectors—such as the relationships between price movements, order book depth, and true trading convictions scaled through volume distributions. This systematic breakdown of the EMH provides the precise technical and academic justification for this thesis. Rather than assuming absolute market randomness, this research actively exploits these structural inefficiencies by engineering an adaptive intelligence layer capable of isolating stable signal vectors out of hyper-volatile digital asset streams.</w:t>
-      </w:r>
-    </w:p>
-    <w:p/>
-    <w:p>
-      <w:pPr>
-        <w:pStyle w:val="Heading2"/>
-      </w:pPr>
-      <w:r>
-        <w:t>The Modern AI and Hardware Infrastructure Speculative Bubble (2023–2025)</w:t>
-      </w:r>
-    </w:p>
-    <w:p/>
-    <w:p>
-      <w:r>
-        <w:t xml:space="preserve">The chronological boundary established within this master's thesis fundamentally captures one of the most volatile, mathematically anomalous, and macroeconomically significant events in the history of global digital business frameworks: the explosive emergence and subsequent structural consolidation of the "Artificial Intelligence and Advanced Hardware Infrastructure Boom" [1] spanning the fiscal periods of 2023 through late 2025. Within the context of </w:t>
-      </w:r>
-      <w:r>
-        <w:t>Information Systems for e-Business</w:t>
-      </w:r>
-      <w:r>
-        <w:t>, this specific chronological epoch serves not merely as a temporal backdrop, but as an aggressive, high-volatility laboratory environment designed to stress-test the operational resilience of modern deep learning predictive algorithms.</w:t>
-      </w:r>
-      <w:r>
-        <w:t xml:space="preserve"> </w:t>
-      </w:r>
-    </w:p>
-    <w:p>
-      <w:r>
-        <w:t>Prior to this structural market shift, global financial asset pricing models operated under relatively predictable macro-regimes characterized by steady consumer technology cycles, institutional supply-chain normalizations following the pandemic disruptions of 2020, and predictable corporate credit structures managed by central banking interest rates. However, the introduction and rapid enterprise adoption of generative artificial intelligence architectures, large language models (LLMs), and hyper-scaled neural networks created an unprecedented, non-linear demand shock throughout the global technology ecosystem.</w:t>
-      </w:r>
-    </w:p>
-    <w:p/>
-    <w:p>
-      <w:r>
-        <w:lastRenderedPageBreak/>
-        <w:t xml:space="preserve">Figure 2.2. </w:t>
-      </w:r>
-      <w:r>
-        <w:t>Parabolic Trajectory of NVIDIA (NVDA) Market Capitalization vs. Industry Moving Averages During the 2023-2025 Hardware Supply Crunch.</w:t>
-      </w:r>
-    </w:p>
-    <w:p/>
-    <w:p>
-      <w:r>
-        <w:t xml:space="preserve">This structural shift completely redefined the valuation metrics of the global semiconductor, data center, and cloud computing markets. At the absolute epicenter of this macroeconomic expansion was NVIDIA Corporation (NVDA), an asset whose financial data series transitions from a standard high-growth technology equity into a highly parabolic, sentiment-driven speculative vehicle. During this intensive multi-year expansion, traditional financial indicators, standard moving averages, and classical autoregressive integrated moving average (ARIMA) statistical forecasting frameworks exhibited complete, systemic performance degradation. This absolute decay in classical predictive power occurred because the underlying asset price movements were no longer tightly coupled with historical valuation baselines, steady price-to-earnings metrics, or efficient informational distributions as hypothesized by the Efficient Market Hypothesis (EMH). Instead, market movements were governed by a hyper-complex confluence of behavioral market sentiment, institutional momentum trading, massive retail capital flows, and intense physical micro-structural constraints. </w:t>
-      </w:r>
-    </w:p>
-    <w:p>
-      <w:r>
-        <w:t>To comprehensively understand why deep recurrent networks like Long Short-Term Memory (LSTM) and Gated Recurrent Units (GRU) are required to model this specific market regime, the system must decompose the structural physics of the 2023–2025 AI bubble into separate, highly interactive corporate realities:</w:t>
-      </w:r>
-    </w:p>
-    <w:p>
-      <w:pPr>
-        <w:pStyle w:val="Heading3"/>
-      </w:pPr>
-      <w:r>
-        <w:t>The Micro-structural Semiconductor Supply Crunch</w:t>
-      </w:r>
-    </w:p>
-    <w:p/>
-    <w:p>
-      <w:r>
-        <w:t>Unlike historical digital asset expansions, such as the software-based dot-com bubble of the late 1990s, the artificial intelligence expansion was bound to absolute, physical manufacturing bottlenecks. Enterprise computing architectures required specialized graphics processing units (GPUs) capable of asynchronous tensor matrix multiplications. The extreme institutional rush to secure compute capacity resulted in severe supply constraints surrounding advanced semiconductor fabrications, silicon wafer allocations, and, critically, High Bandwidth Memory (HBM/VRAM) components.</w:t>
-      </w:r>
-    </w:p>
-    <w:p>
-      <w:r>
-        <w:t xml:space="preserve">Because corporate entities like NVIDIA maintained exclusive commercial control over the proprietary chip architectures and software ecosystems (such as the CUDA computing platform), their financial statements reflected astronomical, non-linear growth in net profit margins. When an information system attempts to model an asset bound to such intense, physical supply imbalances, standard </w:t>
-      </w:r>
-      <w:r>
-        <w:lastRenderedPageBreak/>
-        <w:t>closing price metrics fail to capture the underlying market tension. The volume distribution backing each transaction becomes the primary indicator of institutional accumulation. This reality justifies why this thesis rejects simple open/close scalar points in favor of a mathematically derived Volume Weighted Average Price (VWAP) engine, ensuring that periods of extreme supply shocks are properly scaled by transaction intensity before being introduced to the neural network’s weight matrices.</w:t>
-      </w:r>
-    </w:p>
-    <w:p/>
-    <w:p>
-      <w:pPr>
-        <w:pStyle w:val="Heading3"/>
-      </w:pPr>
-      <w:r>
-        <w:t>The Physics of Parabolic Momentum and Behavioral Speculation</w:t>
-      </w:r>
-    </w:p>
-    <w:p>
-      <w:r>
-        <w:t>During the height of the hardware boom, asset price behaviors exhibited extreme directional persistence, often referred to in quantitative finance as a heavy-tailed, non-Gaussian distribution. In standard linear economics, it is assumed that when an asset price rises significantly above its historical mean, profit-taking forces will immediately act as a negative feedback loop, pulling the price back toward equilibrium (mean reversion). However, during the 2023–2025 regime, the market architecture experienced a strong positive feedback loop.</w:t>
-      </w:r>
-    </w:p>
-    <w:p>
-      <w:r>
-        <w:t>As the valuation of AI infrastructure providers escalated, institutional momentum algorithms, quantitative trend-following index funds, and highly speculative retail traders continuously bought the asset, creating a self-reinforcing upward spiral. This parabolic behavior generates a major challenge for shallow neural configurations due to the presence of non-stationarity—a state where the statistical properties of the time series (mean, variance, and autocorrelation) continuously change over time. Under these conditions, classical models experience immediate "gradient explosions" or become completely desensitized to sudden trend reversals, whereas multi-layered deep learning systems utilizing specialized dropout regularizations ($\text{Dropout} = 0.2$) are specifically structured to prevent absolute overfitting during these localized speculatory waves.</w:t>
-      </w:r>
-    </w:p>
-    <w:p/>
-    <w:p>
-      <w:pPr>
-        <w:pStyle w:val="Heading2"/>
-      </w:pPr>
-      <w:r>
-        <w:t>The Traditional Financial Counterweight: Analyzing JPMorgan Chase (JPM)</w:t>
-      </w:r>
-    </w:p>
-    <w:p/>
-    <w:p>
-      <w:r>
-        <w:t xml:space="preserve">To prevent the developed predictive framework from becoming overly specialized or structurally biased toward the hyper-volatile characteristics of the growth technology sector, this master’s thesis strategically integrates an adversarial corporate counterweight into the data pipeline: JPMorgan Chase &amp; Co. (JPM). Within the operational philosophy of </w:t>
+        <w:t xml:space="preserve">strategically integrates an adversarial corporate counterweight into the data pipeline: JPMorgan Chase &amp; Co. (JPM). Within the operational philosophy of </w:t>
       </w:r>
       <w:r>
         <w:rPr>
@@ -9708,49 +9919,39 @@
         <w:t>Information Systems for e-Business</w:t>
       </w:r>
       <w:r>
-        <w:t xml:space="preserve">, a robust, </w:t>
-      </w:r>
+        <w:t>, a robust, enterprise-grade automated forecasting engine must demonstrate absolute versatility. If a machine learning model achieves high predictive accuracy on a parabolic technology stock but fails catastrophically when applied to a highly regulated, cyclical financial institution, the underlying information system cannot be classified as globally reliable for corporate decision-support deployment.</w:t>
+      </w:r>
+    </w:p>
+    <w:p/>
+    <w:p>
+      <w:r>
+        <w:t>Figure 2.3. Comparative Volatility Analysis: Technology Growth Regime (NVDA) vs. Regulated Banking Cycle Regime (JPM) Over a 10-Year Timeline.</w:t>
+      </w:r>
+    </w:p>
+    <w:p>
+      <w:r>
+        <w:t>JPMorgan Chase represents the absolute antithesis of the speculative, sentiment-driven market structures observed in the semiconductor sector during the AI boom. As one of the largest systemic banking institutions globally, the asset pricing mechanics of JPM are heavily dictated by entirely different macroeconomic vectors:</w:t>
+      </w:r>
+    </w:p>
+    <w:p>
+      <w:r>
+        <w:t>Central Banking Monetary Policy and Interest Rate Cycles: Unlike growth technology corporations whose valuations are heavily dependent on future speculatory cash flows, banking institutions respond directly to the immediate, physical realities of net interest margins (NIM). The timeline analyzed (2014–2026) captures intense shifts in central banking architectures, transitioning from the ultra-low, near-zero interest rate regimes of the late 2010s to the aggressive monetary tightening and interest rate hikes implemented throughout 2022–2024 to combat global inflation.</w:t>
+      </w:r>
+    </w:p>
+    <w:p>
+      <w:r>
+        <w:t>Macroeconomic Credit Cycles and Corporate Liquidity Flows: The financial data stream of a major banking asset serves as a direct proxy for the health of the broader industrial economy. When interest rates rise, corporate loan defaults increase, credit spreads widen, and consumer capital flows shift from risk-on equity markets into stable debt instruments. This creates an asset price series characterized by long-term, low-frequency structural cycles, occasional macro-driven mean reversions, and localized periods of high resistance.</w:t>
+      </w:r>
+    </w:p>
+    <w:p>
+      <w:r>
+        <w:t>From an algorithmic training perspective, introducing JPM into the PyCharm execution environment provides a vital structural baseline. While an asset like NVIDIA tests the deep learning network’s ability to adapt to extreme momentum, parabolic curves, and explosive volatility, an asset like JPMorgan Chase tests the network’s capacity to identify subtle, long-term cyclical patterns, structural support levels, and low-frequency seasonal trends embedded within deep historical datasets.</w:t>
+      </w:r>
+    </w:p>
+    <w:p>
       <w:r>
         <w:lastRenderedPageBreak/>
-        <w:t>enterprise-grade automated forecasting engine must demonstrate absolute versatility. If a machine learning model achieves high predictive accuracy on a parabolic technology stock but fails catastrophically when applied to a highly regulated, cyclical financial institution, the underlying information system cannot be classified as globally reliable for corporate decision-support deployment.</w:t>
-      </w:r>
-    </w:p>
-    <w:p/>
-    <w:p>
-      <w:r>
-        <w:t>Figure 2.3. C</w:t>
-      </w:r>
-      <w:r>
-        <w:t>omparative Volatility Analysis: Technology Growth Regime (NVDA) vs. Regulated Banking Cycle Regime (JPM) Over a 10-Year Timeline.</w:t>
-      </w:r>
-    </w:p>
-    <w:p>
-      <w:r>
-        <w:t>JPMorgan Chase represents the absolute antithesis of the speculative, sentiment-driven market structures observed in the semiconductor sector during the AI boom. As one of the largest systemic banking institutions globally, the asset pricing mechanics of JPM are heavily dictated by entirely different macroeconomic vectors:</w:t>
-      </w:r>
-    </w:p>
-    <w:p>
-      <w:r>
-        <w:t>Central Banking Monetary Policy and Interest Rate Cycles: Unlike growth technology corporations whose valuations are heavily dependent on future speculatory cash flows, banking institutions respond directly to the immediate, physical realities of net interest margins (NIM). The timeline analyzed (2014–2026) captures intense shifts in central banking architectures, transitioning from the ultra-low, near-zero interest rate regimes of the late 2010s to the aggressive monetary tightening and interest rate hikes implemented throughout 2022–2024 to combat global inflation.</w:t>
-      </w:r>
-    </w:p>
-    <w:p>
-      <w:r>
-        <w:t>Macroeconomic Credit Cycles and Corporate Liquidity Flows: The financial data stream of a major banking asset serves as a direct proxy for the health of the broader industrial economy. When interest rates rise, corporate loan defaults increase, credit spreads widen, and consumer capital flows shift from risk-on equity markets into stable debt instruments. This creates an asset price series characterized by long-term, low-frequency structural cycles, occasional macro-driven mean reversions, and localized periods of high resistance.</w:t>
-      </w:r>
-    </w:p>
-    <w:p>
-      <w:r>
-        <w:t>From an algorithmic training perspective, introducing JPM into the PyCharm execution environment provides a vital structural baseline. While an asset like NVIDIA tests the deep learning network’s ability to adapt to extreme momentum, parabolic curves, and explosive volatility, an asset like JPMorgan Chase tests the network’s capacity to identify subtle, long-term cyclical patterns, structural support levels, and low-frequency seasonal trends embedded within deep historical datasets.</w:t>
-      </w:r>
-    </w:p>
-    <w:p>
-      <w:r>
-        <w:t xml:space="preserve">By forcing both the Long Short-Term Memory (LSTM) and Gated Recurrent Unit (GRU) architectures to process this low-volatility, macro-dependent financial series, this research can effectively evaluate whether the complex gating mechanisms of the LSTM are superior at maintaining </w:t>
-      </w:r>
-      <w:r>
-        <w:lastRenderedPageBreak/>
-        <w:t>long-term memory cells over multi-year interest rate cycles, or if the streamlined mathematical efficiency of the GRU layer can achieve lower statistical errors (RMSE and MAE) by ignoring micro-noise and focusing exclusively on macro-level mean-reverting trends. This comprehensive dual-sector configuration ensures that the final Streamlit web application functions as a globally validated, multi-asset enterprise information platform capable of assisting corporate executives across distinct structural segments of the digital economy.</w:t>
+        <w:t>By forcing both the Long Short-Term Memory (LSTM) and Gated Recurrent Unit (GRU) architectures to process this low-volatility, macro-dependent financial series, this research can effectively evaluate whether the complex gating mechanisms of the LSTM are superior at maintaining long-term memory cells over multi-year interest rate cycles, or if the streamlined mathematical efficiency of the GRU layer can achieve lower statistical errors (RMSE and MAE) by ignoring micro-noise and focusing exclusively on macro-level mean-reverting trends. This comprehensive dual-sector configuration ensures that the final Streamlit web application functions as a globally validated, multi-asset enterprise information platform capable of assisting corporate executives across distinct structural segments of the digital economy.</w:t>
       </w:r>
     </w:p>
     <w:p/>
@@ -9784,14 +9985,14 @@
       <w:r>
         <w:br w:type="page"/>
       </w:r>
-      <w:bookmarkStart w:id="4" w:name="_Ref226023022"/>
-      <w:bookmarkStart w:id="5" w:name="_Toc226026626"/>
+      <w:bookmarkStart w:id="6" w:name="_Ref226023022"/>
+      <w:bookmarkStart w:id="7" w:name="_Toc226026626"/>
       <w:r>
         <w:lastRenderedPageBreak/>
         <w:t>Convenții de redactare</w:t>
       </w:r>
-      <w:bookmarkEnd w:id="4"/>
-      <w:bookmarkEnd w:id="5"/>
+      <w:bookmarkEnd w:id="6"/>
+      <w:bookmarkEnd w:id="7"/>
     </w:p>
     <w:p>
       <w:pPr>
@@ -9811,11 +10012,11 @@
       <w:pPr>
         <w:pStyle w:val="Heading2"/>
       </w:pPr>
-      <w:bookmarkStart w:id="6" w:name="_Toc226026627"/>
+      <w:bookmarkStart w:id="8" w:name="_Toc226026627"/>
       <w:r>
         <w:t>Cerințe generale</w:t>
       </w:r>
-      <w:bookmarkEnd w:id="6"/>
+      <w:bookmarkEnd w:id="8"/>
     </w:p>
     <w:p>
       <w:pPr>
@@ -10166,11 +10367,11 @@
       <w:pPr>
         <w:pStyle w:val="Heading2"/>
       </w:pPr>
-      <w:bookmarkStart w:id="7" w:name="_Toc226026628"/>
+      <w:bookmarkStart w:id="9" w:name="_Toc226026628"/>
       <w:r>
         <w:t>Structura documentului</w:t>
       </w:r>
-      <w:bookmarkEnd w:id="7"/>
+      <w:bookmarkEnd w:id="9"/>
       <w:r>
         <w:fldChar w:fldCharType="begin"/>
       </w:r>
@@ -10407,7 +10608,7 @@
       <w:pPr>
         <w:pStyle w:val="Heading2"/>
       </w:pPr>
-      <w:bookmarkStart w:id="8" w:name="_Toc226026629"/>
+      <w:bookmarkStart w:id="10" w:name="_Toc226026629"/>
       <w:r>
         <w:t>Dimensiuni</w:t>
       </w:r>
@@ -10423,7 +10624,7 @@
       <w:r>
         <w:t>le lucrării</w:t>
       </w:r>
-      <w:bookmarkEnd w:id="8"/>
+      <w:bookmarkEnd w:id="10"/>
     </w:p>
     <w:p>
       <w:pPr>
@@ -10504,11 +10705,11 @@
       <w:pPr>
         <w:pStyle w:val="Heading2"/>
       </w:pPr>
-      <w:bookmarkStart w:id="9" w:name="_Toc226026630"/>
+      <w:bookmarkStart w:id="11" w:name="_Toc226026630"/>
       <w:r>
         <w:t>Elemente de tehnoredactare</w:t>
       </w:r>
-      <w:bookmarkEnd w:id="9"/>
+      <w:bookmarkEnd w:id="11"/>
     </w:p>
     <w:p>
       <w:r>
@@ -10634,11 +10835,11 @@
       <w:pPr>
         <w:pStyle w:val="Heading2"/>
       </w:pPr>
-      <w:bookmarkStart w:id="10" w:name="_Toc226026631"/>
+      <w:bookmarkStart w:id="12" w:name="_Toc226026631"/>
       <w:r>
         <w:t>Formulele matematice</w:t>
       </w:r>
-      <w:bookmarkEnd w:id="10"/>
+      <w:bookmarkEnd w:id="12"/>
       <w:r>
         <w:fldChar w:fldCharType="begin"/>
       </w:r>
@@ -10670,11 +10871,11 @@
       <w:pPr>
         <w:pStyle w:val="Heading2"/>
       </w:pPr>
-      <w:bookmarkStart w:id="11" w:name="_Toc226026632"/>
+      <w:bookmarkStart w:id="13" w:name="_Toc226026632"/>
       <w:r>
         <w:t>Ilustrațiile</w:t>
       </w:r>
-      <w:bookmarkEnd w:id="11"/>
+      <w:bookmarkEnd w:id="13"/>
       <w:r>
         <w:fldChar w:fldCharType="begin"/>
       </w:r>
@@ -10689,7 +10890,7 @@
       <w:pPr>
         <w:pStyle w:val="Heading3"/>
       </w:pPr>
-      <w:bookmarkStart w:id="12" w:name="_Toc226026633"/>
+      <w:bookmarkStart w:id="14" w:name="_Toc226026633"/>
       <w:r>
         <w:t>Figuri</w:t>
       </w:r>
@@ -10705,7 +10906,7 @@
       <w:r>
         <w:t>le</w:t>
       </w:r>
-      <w:bookmarkEnd w:id="12"/>
+      <w:bookmarkEnd w:id="14"/>
     </w:p>
     <w:p>
       <w:pPr>
@@ -10745,8 +10946,8 @@
       <w:pPr>
         <w:pStyle w:val="Heading3"/>
       </w:pPr>
-      <w:bookmarkStart w:id="13" w:name="_Ref309893857"/>
-      <w:bookmarkStart w:id="14" w:name="_Toc226026634"/>
+      <w:bookmarkStart w:id="15" w:name="_Ref309893857"/>
+      <w:bookmarkStart w:id="16" w:name="_Toc226026634"/>
       <w:r>
         <w:lastRenderedPageBreak/>
         <w:t>Tabele</w:t>
@@ -10763,8 +10964,8 @@
       <w:r>
         <w:t>le</w:t>
       </w:r>
-      <w:bookmarkEnd w:id="13"/>
-      <w:bookmarkEnd w:id="14"/>
+      <w:bookmarkEnd w:id="15"/>
+      <w:bookmarkEnd w:id="16"/>
     </w:p>
     <w:p>
       <w:pPr>
@@ -10858,8 +11059,8 @@
           <w:noProof/>
         </w:rPr>
         <w:pict w14:anchorId="11EE2E4C">
-          <v:shape id="_x0000_i1027" type="#_x0000_t75" alt="" style="width:119pt;height:143pt;visibility:visible;mso-width-percent:0;mso-height-percent:0;mso-width-percent:0;mso-height-percent:0">
-            <v:imagedata r:id="rId14" o:title=""/>
+          <v:shape id="_x0000_i1059" type="#_x0000_t75" alt="" style="width:119.25pt;height:143.25pt;visibility:visible;mso-width-percent:0;mso-height-percent:0;mso-width-percent:0;mso-height-percent:0">
+            <v:imagedata r:id="rId13" o:title=""/>
           </v:shape>
         </w:pict>
       </w:r>
@@ -10872,8 +11073,8 @@
           <w:noProof/>
         </w:rPr>
       </w:pPr>
-      <w:bookmarkStart w:id="15" w:name="_Ref309893008"/>
-      <w:bookmarkStart w:id="16" w:name="_Toc226026654"/>
+      <w:bookmarkStart w:id="17" w:name="_Ref309893008"/>
+      <w:bookmarkStart w:id="18" w:name="_Toc226026654"/>
       <w:r>
         <w:t xml:space="preserve">Figura </w:t>
       </w:r>
@@ -10895,11 +11096,11 @@
       <w:r>
         <w:fldChar w:fldCharType="end"/>
       </w:r>
-      <w:bookmarkEnd w:id="15"/>
+      <w:bookmarkEnd w:id="17"/>
       <w:r>
         <w:t>. Selectarea prin click dreapta a opțiunii „Update field”</w:t>
       </w:r>
-      <w:bookmarkEnd w:id="16"/>
+      <w:bookmarkEnd w:id="18"/>
     </w:p>
     <w:p>
       <w:pPr>
@@ -10949,8 +11150,8 @@
           <w:noProof/>
         </w:rPr>
         <w:pict w14:anchorId="74916B1C">
-          <v:shape id="_x0000_i1026" type="#_x0000_t75" alt="" style="width:222pt;height:113pt;visibility:visible;mso-width-percent:0;mso-height-percent:0;mso-width-percent:0;mso-height-percent:0">
-            <v:imagedata r:id="rId15" o:title=""/>
+          <v:shape id="_x0000_i1060" type="#_x0000_t75" alt="" style="width:222pt;height:113.25pt;visibility:visible;mso-width-percent:0;mso-height-percent:0;mso-width-percent:0;mso-height-percent:0">
+            <v:imagedata r:id="rId14" o:title=""/>
           </v:shape>
         </w:pict>
       </w:r>
@@ -10960,8 +11161,8 @@
         <w:pStyle w:val="Caption"/>
         <w:jc w:val="center"/>
       </w:pPr>
-      <w:bookmarkStart w:id="17" w:name="_Ref309893210"/>
-      <w:bookmarkStart w:id="18" w:name="_Toc226026655"/>
+      <w:bookmarkStart w:id="19" w:name="_Ref309893210"/>
+      <w:bookmarkStart w:id="20" w:name="_Toc226026655"/>
       <w:r>
         <w:t xml:space="preserve">Figura </w:t>
       </w:r>
@@ -10983,11 +11184,11 @@
       <w:r>
         <w:fldChar w:fldCharType="end"/>
       </w:r>
-      <w:bookmarkEnd w:id="17"/>
+      <w:bookmarkEnd w:id="19"/>
       <w:r>
         <w:t>. Actualizarea întregului tabel</w:t>
       </w:r>
-      <w:bookmarkEnd w:id="18"/>
+      <w:bookmarkEnd w:id="20"/>
     </w:p>
     <w:p>
       <w:pPr>
@@ -11012,7 +11213,7 @@
         <w:spacing w:after="0"/>
         <w:jc w:val="center"/>
       </w:pPr>
-      <w:bookmarkStart w:id="19" w:name="_Toc226026674"/>
+      <w:bookmarkStart w:id="21" w:name="_Toc226026674"/>
       <w:r>
         <w:t xml:space="preserve">Tabel </w:t>
       </w:r>
@@ -11037,7 +11238,7 @@
       <w:r>
         <w:t>. Nume de utilizatori și valorile rezumat ale parolelor acestora.</w:t>
       </w:r>
-      <w:bookmarkEnd w:id="19"/>
+      <w:bookmarkEnd w:id="21"/>
     </w:p>
     <w:tbl>
       <w:tblPr>
@@ -11658,7 +11859,7 @@
       <w:pPr>
         <w:pStyle w:val="Heading3"/>
       </w:pPr>
-      <w:bookmarkStart w:id="20" w:name="_Toc226026635"/>
+      <w:bookmarkStart w:id="22" w:name="_Toc226026635"/>
       <w:r>
         <w:t>Legenda</w:t>
       </w:r>
@@ -11674,7 +11875,7 @@
       <w:r>
         <w:t xml:space="preserve"> (unei figuri/tabele)</w:t>
       </w:r>
-      <w:bookmarkEnd w:id="20"/>
+      <w:bookmarkEnd w:id="22"/>
     </w:p>
     <w:p>
       <w:pPr>
@@ -11697,27 +11898,27 @@
       <w:r>
         <w:br w:type="page"/>
       </w:r>
-      <w:bookmarkStart w:id="21" w:name="_Ref309844154"/>
-      <w:bookmarkStart w:id="22" w:name="_Toc226026636"/>
+      <w:bookmarkStart w:id="23" w:name="_Ref309844154"/>
+      <w:bookmarkStart w:id="24" w:name="_Toc226026636"/>
       <w:r>
         <w:lastRenderedPageBreak/>
         <w:t>Termeni de utilizare</w:t>
       </w:r>
-      <w:bookmarkEnd w:id="21"/>
-      <w:bookmarkEnd w:id="22"/>
+      <w:bookmarkEnd w:id="23"/>
+      <w:bookmarkEnd w:id="24"/>
     </w:p>
     <w:p>
       <w:pPr>
         <w:pStyle w:val="Heading2"/>
       </w:pPr>
-      <w:bookmarkStart w:id="23" w:name="_Toc226026637"/>
+      <w:bookmarkStart w:id="25" w:name="_Toc226026637"/>
       <w:r>
         <w:t>Autor</w:t>
       </w:r>
       <w:r>
         <w:t>ii</w:t>
       </w:r>
-      <w:bookmarkEnd w:id="23"/>
+      <w:bookmarkEnd w:id="25"/>
       <w:r>
         <w:t xml:space="preserve"> </w:t>
       </w:r>
@@ -11831,11 +12032,11 @@
       <w:pPr>
         <w:pStyle w:val="Heading2"/>
       </w:pPr>
-      <w:bookmarkStart w:id="24" w:name="_Toc226026638"/>
+      <w:bookmarkStart w:id="26" w:name="_Toc226026638"/>
       <w:r>
         <w:t>Licența de utilizare</w:t>
       </w:r>
-      <w:bookmarkEnd w:id="24"/>
+      <w:bookmarkEnd w:id="26"/>
     </w:p>
     <w:p>
       <w:pPr>
@@ -11931,14 +12132,14 @@
       <w:r>
         <w:br w:type="page"/>
       </w:r>
-      <w:bookmarkStart w:id="25" w:name="_Ref226023042"/>
-      <w:bookmarkStart w:id="26" w:name="_Toc226026639"/>
+      <w:bookmarkStart w:id="27" w:name="_Ref226023042"/>
+      <w:bookmarkStart w:id="28" w:name="_Toc226026639"/>
       <w:r>
         <w:lastRenderedPageBreak/>
         <w:t>Cum se scrie o teză?</w:t>
       </w:r>
-      <w:bookmarkEnd w:id="25"/>
-      <w:bookmarkEnd w:id="26"/>
+      <w:bookmarkEnd w:id="27"/>
+      <w:bookmarkEnd w:id="28"/>
     </w:p>
     <w:p>
       <w:pPr>
@@ -12045,7 +12246,7 @@
       <w:pPr>
         <w:pStyle w:val="Heading2"/>
       </w:pPr>
-      <w:bookmarkStart w:id="27" w:name="_Toc226026640"/>
+      <w:bookmarkStart w:id="29" w:name="_Toc226026640"/>
       <w:r>
         <w:t xml:space="preserve">Pregătire </w:t>
       </w:r>
@@ -12055,7 +12256,7 @@
       <w:r>
         <w:t xml:space="preserve"> planificare</w:t>
       </w:r>
-      <w:bookmarkEnd w:id="27"/>
+      <w:bookmarkEnd w:id="29"/>
     </w:p>
     <w:p>
       <w:pPr>
@@ -12448,7 +12649,7 @@
       <w:pPr>
         <w:pStyle w:val="Heading2"/>
       </w:pPr>
-      <w:bookmarkStart w:id="28" w:name="_Toc226026641"/>
+      <w:bookmarkStart w:id="30" w:name="_Toc226026641"/>
       <w:r>
         <w:lastRenderedPageBreak/>
         <w:t xml:space="preserve">Cercetare </w:t>
@@ -12459,7 +12660,7 @@
       <w:r>
         <w:t>i colectare de date</w:t>
       </w:r>
-      <w:bookmarkEnd w:id="28"/>
+      <w:bookmarkEnd w:id="30"/>
     </w:p>
     <w:p>
       <w:pPr>
@@ -12689,11 +12890,11 @@
       <w:pPr>
         <w:pStyle w:val="Heading2"/>
       </w:pPr>
-      <w:bookmarkStart w:id="29" w:name="_Toc226026642"/>
+      <w:bookmarkStart w:id="31" w:name="_Toc226026642"/>
       <w:r>
         <w:t>Procesul de scriere</w:t>
       </w:r>
-      <w:bookmarkEnd w:id="29"/>
+      <w:bookmarkEnd w:id="31"/>
     </w:p>
     <w:p>
       <w:pPr>
@@ -13169,14 +13370,14 @@
       <w:pPr>
         <w:pStyle w:val="Heading2"/>
       </w:pPr>
-      <w:bookmarkStart w:id="30" w:name="_Toc226026643"/>
+      <w:bookmarkStart w:id="32" w:name="_Toc226026643"/>
       <w:r>
         <w:t>Organizarea</w:t>
       </w:r>
       <w:r>
         <w:t xml:space="preserve"> unei teze standard</w:t>
       </w:r>
-      <w:bookmarkEnd w:id="30"/>
+      <w:bookmarkEnd w:id="32"/>
     </w:p>
     <w:p>
       <w:pPr>
@@ -13557,7 +13758,7 @@
       <w:pPr>
         <w:pStyle w:val="Heading2"/>
       </w:pPr>
-      <w:bookmarkStart w:id="31" w:name="_Toc226026644"/>
+      <w:bookmarkStart w:id="33" w:name="_Toc226026644"/>
       <w:r>
         <w:t>Finalizare</w:t>
       </w:r>
@@ -13573,7 +13774,7 @@
       <w:r>
         <w:t>alte sfaturi utile</w:t>
       </w:r>
-      <w:bookmarkEnd w:id="31"/>
+      <w:bookmarkEnd w:id="33"/>
     </w:p>
     <w:p>
       <w:pPr>
@@ -14022,12 +14223,12 @@
       <w:r>
         <w:br w:type="page"/>
       </w:r>
-      <w:bookmarkStart w:id="32" w:name="_Toc226026645"/>
+      <w:bookmarkStart w:id="34" w:name="_Toc226026645"/>
       <w:r>
         <w:lastRenderedPageBreak/>
         <w:t>Concluzii</w:t>
       </w:r>
-      <w:bookmarkEnd w:id="32"/>
+      <w:bookmarkEnd w:id="34"/>
     </w:p>
     <w:p>
       <w:pPr>
@@ -14247,11 +14448,11 @@
       <w:pPr>
         <w:pStyle w:val="Heading2"/>
       </w:pPr>
-      <w:bookmarkStart w:id="33" w:name="_Toc226026646"/>
+      <w:bookmarkStart w:id="35" w:name="_Toc226026646"/>
       <w:r>
         <w:t>Strângeți idei pentru concluzie</w:t>
       </w:r>
-      <w:bookmarkEnd w:id="33"/>
+      <w:bookmarkEnd w:id="35"/>
     </w:p>
     <w:p>
       <w:pPr>
@@ -14304,7 +14505,7 @@
         <w:spacing w:after="0"/>
         <w:jc w:val="center"/>
       </w:pPr>
-      <w:bookmarkStart w:id="34" w:name="_Toc226026675"/>
+      <w:bookmarkStart w:id="36" w:name="_Toc226026675"/>
       <w:r>
         <w:lastRenderedPageBreak/>
         <w:t xml:space="preserve">Tabel </w:t>
@@ -14330,7 +14531,7 @@
       <w:r>
         <w:t>. Diferențe între Discuții și Concluzii.</w:t>
       </w:r>
-      <w:bookmarkEnd w:id="34"/>
+      <w:bookmarkEnd w:id="36"/>
     </w:p>
     <w:tbl>
       <w:tblPr>
@@ -14468,7 +14669,7 @@
       <w:pPr>
         <w:pStyle w:val="Heading2"/>
       </w:pPr>
-      <w:bookmarkStart w:id="35" w:name="_Toc226026647"/>
+      <w:bookmarkStart w:id="37" w:name="_Toc226026647"/>
       <w:r>
         <w:t xml:space="preserve">Alinierea concluziilor cu </w:t>
       </w:r>
@@ -14478,7 +14679,7 @@
       <w:r>
         <w:t xml:space="preserve"> anterioare ale tezei</w:t>
       </w:r>
-      <w:bookmarkEnd w:id="35"/>
+      <w:bookmarkEnd w:id="37"/>
     </w:p>
     <w:p>
       <w:pPr>
@@ -14627,8 +14828,8 @@
       <w:r>
         <w:br w:type="page"/>
       </w:r>
-      <w:bookmarkStart w:id="36" w:name="_Ref309895090"/>
-      <w:bookmarkStart w:id="37" w:name="_Toc226026648"/>
+      <w:bookmarkStart w:id="38" w:name="_Ref309895090"/>
+      <w:bookmarkStart w:id="39" w:name="_Toc226026648"/>
       <w:r>
         <w:lastRenderedPageBreak/>
         <w:t>B</w:t>
@@ -14636,8 +14837,8 @@
       <w:r>
         <w:t>ibliografie</w:t>
       </w:r>
-      <w:bookmarkEnd w:id="36"/>
-      <w:bookmarkEnd w:id="37"/>
+      <w:bookmarkEnd w:id="38"/>
+      <w:bookmarkEnd w:id="39"/>
       <w:r>
         <w:fldChar w:fldCharType="begin"/>
       </w:r>
@@ -15397,7 +15598,7 @@
       <w:r>
         <w:br w:type="page"/>
       </w:r>
-      <w:bookmarkStart w:id="38" w:name="_Toc226026649"/>
+      <w:bookmarkStart w:id="40" w:name="_Toc226026649"/>
       <w:r>
         <w:lastRenderedPageBreak/>
         <w:t>R</w:t>
@@ -15405,7 +15606,7 @@
       <w:r>
         <w:t>eferințe web</w:t>
       </w:r>
-      <w:bookmarkEnd w:id="38"/>
+      <w:bookmarkEnd w:id="40"/>
       <w:r>
         <w:fldChar w:fldCharType="begin"/>
       </w:r>
@@ -15416,963 +15617,12 @@
         <w:fldChar w:fldCharType="end"/>
       </w:r>
     </w:p>
-    <w:p>
-      <w:pPr>
-        <w:pStyle w:val="Default"/>
-        <w:jc w:val="both"/>
-        <w:rPr>
-          <w:lang w:val="ro-RO"/>
-        </w:rPr>
-      </w:pPr>
-      <w:r>
-        <w:rPr>
-          <w:lang w:val="ro-RO"/>
-        </w:rPr>
-        <w:t xml:space="preserve">Recomandăm și aici respectarea regulilor enunțate pentru secțiunea </w:t>
-      </w:r>
-      <w:r>
-        <w:rPr>
-          <w:lang w:val="ro-RO"/>
-        </w:rPr>
-        <w:fldChar w:fldCharType="begin"/>
-      </w:r>
-      <w:r>
-        <w:rPr>
-          <w:lang w:val="ro-RO"/>
-        </w:rPr>
-        <w:instrText xml:space="preserve"> REF _Ref309895090 \r \h </w:instrText>
-      </w:r>
-      <w:r>
-        <w:rPr>
-          <w:lang w:val="ro-RO"/>
-        </w:rPr>
-        <w:instrText xml:space="preserve"> \* MERGEFORMAT </w:instrText>
-      </w:r>
-      <w:r>
-        <w:rPr>
-          <w:lang w:val="ro-RO"/>
-        </w:rPr>
-      </w:r>
-      <w:r>
-        <w:rPr>
-          <w:lang w:val="ro-RO"/>
-        </w:rPr>
-        <w:fldChar w:fldCharType="separate"/>
-      </w:r>
-      <w:r>
-        <w:rPr>
-          <w:lang w:val="ro-RO"/>
-        </w:rPr>
-        <w:t>5</w:t>
-      </w:r>
-      <w:r>
-        <w:rPr>
-          <w:lang w:val="ro-RO"/>
-        </w:rPr>
-        <w:fldChar w:fldCharType="end"/>
-      </w:r>
-      <w:r>
-        <w:rPr>
-          <w:lang w:val="ro-RO"/>
-        </w:rPr>
-        <w:t>.</w:t>
-      </w:r>
-    </w:p>
-    <w:p>
-      <w:pPr>
-        <w:pStyle w:val="Default"/>
-        <w:jc w:val="both"/>
-        <w:rPr>
-          <w:lang w:val="ro-RO"/>
-        </w:rPr>
-      </w:pPr>
-    </w:p>
-    <w:p>
-      <w:pPr>
-        <w:pStyle w:val="Default"/>
-        <w:jc w:val="both"/>
-        <w:rPr>
-          <w:lang w:val="ro-RO"/>
-        </w:rPr>
-      </w:pPr>
-      <w:r>
-        <w:rPr>
-          <w:lang w:val="ro-RO"/>
-        </w:rPr>
-        <w:t>[Alm08] – Pedro de Almeida, Patrik F</w:t>
-      </w:r>
-      <w:r>
-        <w:rPr>
-          <w:lang w:val="ro-RO"/>
-        </w:rPr>
-        <w:t>u</w:t>
-      </w:r>
-      <w:r>
-        <w:rPr>
-          <w:lang w:val="ro-RO"/>
-        </w:rPr>
-        <w:t xml:space="preserve">hrer, </w:t>
-      </w:r>
-      <w:r>
-        <w:rPr>
-          <w:i/>
-          <w:iCs/>
-          <w:lang w:val="ro-RO"/>
-        </w:rPr>
-        <w:t>Documentation Guidelines for Diploma and Master Thesis</w:t>
-      </w:r>
-      <w:r>
-        <w:rPr>
-          <w:lang w:val="ro-RO"/>
-        </w:rPr>
-        <w:t xml:space="preserve">, Universitatea din Fribourg, Elveția, 2008, disponibil on-line la adresa </w:t>
-      </w:r>
-      <w:r>
-        <w:rPr>
-          <w:lang w:val="ro-RO"/>
-        </w:rPr>
-        <w:t>http://diuf.unifr.ch/drupal/softeng/teaching/guidelines</w:t>
-      </w:r>
-      <w:r>
-        <w:rPr>
-          <w:lang w:val="ro-RO"/>
-        </w:rPr>
-        <w:t xml:space="preserve"> </w:t>
-      </w:r>
-    </w:p>
-    <w:p>
-      <w:pPr>
-        <w:pStyle w:val="Default"/>
-        <w:jc w:val="both"/>
-        <w:rPr>
-          <w:lang w:val="ro-RO"/>
-        </w:rPr>
-      </w:pPr>
-    </w:p>
-    <w:p>
-      <w:pPr>
-        <w:pStyle w:val="Default"/>
-        <w:jc w:val="both"/>
-        <w:rPr>
-          <w:lang w:val="ro-RO"/>
-        </w:rPr>
-      </w:pPr>
-      <w:r>
-        <w:rPr>
-          <w:lang w:val="ro-RO"/>
-        </w:rPr>
-        <w:t xml:space="preserve">[Olt07] – Th. Olteanu, C. Albu, </w:t>
-      </w:r>
-      <w:r>
-        <w:rPr>
-          <w:i/>
-          <w:lang w:val="ro-RO"/>
-        </w:rPr>
-        <w:t>Ghid pentru redactarea lucrării de diplomă sau a disertaţiei de mastera</w:t>
-      </w:r>
-      <w:r>
-        <w:rPr>
-          <w:i/>
-          <w:lang w:val="ro-RO"/>
-        </w:rPr>
-        <w:t xml:space="preserve">t. </w:t>
-      </w:r>
-      <w:r>
-        <w:rPr>
-          <w:lang w:val="ro-RO"/>
-        </w:rPr>
-        <w:t xml:space="preserve">Universitatea Română de Arte și Științe „Gheorghe Cristea”, 2007, disponibil via web la adresa http://www.ugc.ro/tpl/GHID REDACTARE DIPLOMA LICENTA.pdf </w:t>
-      </w:r>
-    </w:p>
-    <w:p>
-      <w:pPr>
-        <w:pStyle w:val="Default"/>
-        <w:jc w:val="both"/>
-        <w:rPr>
-          <w:lang w:val="ro-RO"/>
-        </w:rPr>
-      </w:pPr>
-    </w:p>
-    <w:p>
-      <w:pPr>
-        <w:pStyle w:val="Default"/>
-        <w:rPr>
-          <w:lang w:val="ro-RO"/>
-        </w:rPr>
-      </w:pPr>
-    </w:p>
-    <w:p>
-      <w:pPr>
-        <w:pStyle w:val="Default"/>
-        <w:rPr>
-          <w:lang w:val="ro-RO"/>
-        </w:rPr>
-      </w:pPr>
-    </w:p>
-    <w:p>
-      <w:pPr>
-        <w:pStyle w:val="Default"/>
-        <w:rPr>
-          <w:lang w:val="ro-RO"/>
-        </w:rPr>
-      </w:pPr>
-    </w:p>
-    <w:p>
-      <w:pPr>
-        <w:pStyle w:val="Default"/>
-        <w:rPr>
-          <w:lang w:val="ro-RO"/>
-        </w:rPr>
-      </w:pPr>
-    </w:p>
-    <w:p>
-      <w:pPr>
-        <w:pStyle w:val="Default"/>
-        <w:rPr>
-          <w:lang w:val="ro-RO"/>
-        </w:rPr>
-      </w:pPr>
-    </w:p>
-    <w:p>
-      <w:pPr>
-        <w:pStyle w:val="Default"/>
-        <w:rPr>
-          <w:lang w:val="ro-RO"/>
-        </w:rPr>
-      </w:pPr>
-    </w:p>
-    <w:p>
-      <w:pPr>
-        <w:pStyle w:val="Heading1"/>
-        <w:numPr>
-          <w:ilvl w:val="0"/>
-          <w:numId w:val="26"/>
-        </w:numPr>
-      </w:pPr>
-      <w:r>
-        <w:br w:type="page"/>
-      </w:r>
-      <w:bookmarkStart w:id="39" w:name="_Toc226026650"/>
-      <w:r>
-        <w:lastRenderedPageBreak/>
-        <w:t>Codul sursă</w:t>
-      </w:r>
-      <w:bookmarkEnd w:id="39"/>
-    </w:p>
-    <w:p>
-      <w:pPr>
-        <w:pStyle w:val="Default"/>
-        <w:jc w:val="both"/>
-        <w:rPr>
-          <w:lang w:val="ro-RO"/>
-        </w:rPr>
-      </w:pPr>
-      <w:r>
-        <w:rPr>
-          <w:lang w:val="ro-RO"/>
-        </w:rPr>
-        <w:t>În această anexă se adaugă codul sursă al aplicației…</w:t>
-      </w:r>
-    </w:p>
-    <w:p>
-      <w:pPr>
-        <w:pStyle w:val="Default"/>
-        <w:rPr>
-          <w:lang w:val="ro-RO"/>
-        </w:rPr>
-      </w:pPr>
-    </w:p>
-    <w:p>
-      <w:pPr>
-        <w:pStyle w:val="Default"/>
-        <w:rPr>
-          <w:lang w:val="ro-RO"/>
-        </w:rPr>
-      </w:pPr>
-    </w:p>
-    <w:p>
-      <w:pPr>
-        <w:pStyle w:val="Default"/>
-        <w:rPr>
-          <w:lang w:val="ro-RO"/>
-        </w:rPr>
-      </w:pPr>
-    </w:p>
-    <w:p>
-      <w:pPr>
-        <w:pStyle w:val="Default"/>
-        <w:rPr>
-          <w:lang w:val="ro-RO"/>
-        </w:rPr>
-      </w:pPr>
-    </w:p>
-    <w:p>
-      <w:pPr>
-        <w:pStyle w:val="Default"/>
-        <w:rPr>
-          <w:lang w:val="ro-RO"/>
-        </w:rPr>
-      </w:pPr>
-    </w:p>
-    <w:p>
-      <w:pPr>
-        <w:pStyle w:val="Heading1"/>
-        <w:numPr>
-          <w:ilvl w:val="0"/>
-          <w:numId w:val="27"/>
-        </w:numPr>
-      </w:pPr>
-      <w:r>
-        <w:br w:type="page"/>
-      </w:r>
-      <w:bookmarkStart w:id="40" w:name="_Toc226026651"/>
-      <w:r>
-        <w:lastRenderedPageBreak/>
-        <w:t>Site-ul web al proiectului</w:t>
-      </w:r>
-      <w:bookmarkEnd w:id="40"/>
-    </w:p>
-    <w:p>
-      <w:pPr>
-        <w:pStyle w:val="Default"/>
-        <w:ind w:firstLine="432"/>
-        <w:jc w:val="both"/>
-        <w:rPr>
-          <w:lang w:val="ro-RO"/>
-        </w:rPr>
-      </w:pPr>
-      <w:r>
-        <w:rPr>
-          <w:lang w:val="ro-RO"/>
-        </w:rPr>
-        <w:t>Autorul prezintă în această anexă (opțională) site-ul web asociat proiectului său.</w:t>
-      </w:r>
-      <w:r>
-        <w:rPr>
-          <w:lang w:val="ro-RO"/>
-        </w:rPr>
-        <w:t xml:space="preserve"> Alternativa la site-ul web al proiectului poate fi un link către un repository software public, de ex. GitHub.</w:t>
-      </w:r>
-    </w:p>
-    <w:p>
-      <w:pPr>
-        <w:pStyle w:val="Default"/>
-        <w:rPr>
-          <w:lang w:val="ro-RO"/>
-        </w:rPr>
-      </w:pPr>
-    </w:p>
-    <w:p>
-      <w:pPr>
-        <w:pStyle w:val="Default"/>
-        <w:rPr>
-          <w:lang w:val="ro-RO"/>
-        </w:rPr>
-      </w:pPr>
-    </w:p>
-    <w:p>
-      <w:pPr>
-        <w:pStyle w:val="Default"/>
-        <w:rPr>
-          <w:lang w:val="ro-RO"/>
-        </w:rPr>
-      </w:pPr>
-    </w:p>
-    <w:p>
-      <w:pPr>
-        <w:pStyle w:val="Default"/>
-        <w:rPr>
-          <w:lang w:val="ro-RO"/>
-        </w:rPr>
-      </w:pPr>
-    </w:p>
-    <w:p>
-      <w:pPr>
-        <w:pStyle w:val="Default"/>
-        <w:rPr>
-          <w:lang w:val="ro-RO"/>
-        </w:rPr>
-      </w:pPr>
-    </w:p>
-    <w:p>
-      <w:pPr>
-        <w:pStyle w:val="Default"/>
-        <w:rPr>
-          <w:lang w:val="ro-RO"/>
-        </w:rPr>
-      </w:pPr>
-    </w:p>
-    <w:p>
-      <w:pPr>
-        <w:pStyle w:val="Heading1"/>
-        <w:numPr>
-          <w:ilvl w:val="0"/>
-          <w:numId w:val="28"/>
-        </w:numPr>
-      </w:pPr>
-      <w:r>
-        <w:br w:type="page"/>
-      </w:r>
-      <w:bookmarkStart w:id="41" w:name="_Toc226026652"/>
-      <w:r>
-        <w:lastRenderedPageBreak/>
-        <w:t>CD / DVD</w:t>
-      </w:r>
-      <w:r>
-        <w:t xml:space="preserve"> / STICK USB</w:t>
-      </w:r>
-      <w:bookmarkEnd w:id="41"/>
-      <w:r>
-        <w:t xml:space="preserve"> </w:t>
-      </w:r>
-    </w:p>
-    <w:p>
-      <w:pPr>
-        <w:pStyle w:val="Default"/>
-        <w:ind w:firstLine="432"/>
-        <w:jc w:val="both"/>
-        <w:rPr>
-          <w:lang w:val="ro-RO"/>
-        </w:rPr>
-      </w:pPr>
-      <w:r>
-        <w:rPr>
-          <w:lang w:val="ro-RO"/>
-        </w:rPr>
-        <w:t xml:space="preserve">Autorul atașează în această anexă </w:t>
-      </w:r>
-      <w:r>
-        <w:rPr>
-          <w:b/>
-          <w:bCs/>
-          <w:lang w:val="ro-RO"/>
-        </w:rPr>
-        <w:t>obligatorie</w:t>
-      </w:r>
-      <w:r>
-        <w:rPr>
-          <w:b/>
-          <w:bCs/>
-          <w:lang w:val="ro-RO"/>
-        </w:rPr>
-        <w:t>,</w:t>
-      </w:r>
-      <w:r>
-        <w:rPr>
-          <w:b/>
-          <w:bCs/>
-          <w:lang w:val="ro-RO"/>
-        </w:rPr>
-        <w:t xml:space="preserve"> pe suport media extern</w:t>
-      </w:r>
-      <w:r>
-        <w:rPr>
-          <w:lang w:val="ro-RO"/>
-        </w:rPr>
-        <w:t>,</w:t>
-      </w:r>
-      <w:r>
-        <w:rPr>
-          <w:lang w:val="ro-RO"/>
-        </w:rPr>
-        <w:t xml:space="preserve"> versiunea electronică a aplicației, </w:t>
-      </w:r>
-      <w:r>
-        <w:rPr>
-          <w:lang w:val="ro-RO"/>
-        </w:rPr>
-        <w:t>a acestei lucrări, precum și prezentarea finală a tezei</w:t>
-      </w:r>
-      <w:r>
-        <w:rPr>
-          <w:lang w:val="ro-RO"/>
-        </w:rPr>
-        <w:t>.</w:t>
-      </w:r>
-    </w:p>
-    <w:p>
-      <w:pPr>
-        <w:pStyle w:val="Default"/>
-        <w:ind w:firstLine="432"/>
-        <w:jc w:val="both"/>
-        <w:rPr>
-          <w:lang w:val="ro-RO"/>
-        </w:rPr>
-      </w:pPr>
-      <w:r>
-        <w:rPr>
-          <w:lang w:val="ro-RO"/>
-        </w:rPr>
-        <w:t>Acolo unde este cazul, autorul va adăuga la lucrare, pe lângă suportul media: CD/DVD/stick USB și un link către un repository de software (de ex. GitHub).</w:t>
-      </w:r>
-    </w:p>
-    <w:p>
-      <w:pPr>
-        <w:pStyle w:val="Default"/>
-        <w:jc w:val="both"/>
-        <w:rPr>
-          <w:lang w:val="ro-RO"/>
-        </w:rPr>
-      </w:pPr>
-    </w:p>
-    <w:p>
-      <w:pPr>
-        <w:pStyle w:val="Default"/>
-        <w:rPr>
-          <w:lang w:val="ro-RO"/>
-        </w:rPr>
-      </w:pPr>
-    </w:p>
-    <w:p>
-      <w:pPr>
-        <w:pStyle w:val="Default"/>
-        <w:jc w:val="center"/>
-        <w:rPr>
-          <w:lang w:val="ro-RO"/>
-        </w:rPr>
-      </w:pPr>
-      <w:r>
-        <w:rPr>
-          <w:noProof/>
-          <w:lang w:val="ro-RO"/>
-        </w:rPr>
-        <w:pict w14:anchorId="6BED52C8">
-          <v:shape id="_x0000_i1025" type="#_x0000_t75" alt="" style="width:190pt;height:190pt;mso-width-percent:0;mso-height-percent:0;mso-width-percent:0;mso-height-percent:0">
-            <v:imagedata r:id="rId16" o:title=""/>
-          </v:shape>
-        </w:pict>
-      </w:r>
-    </w:p>
-    <w:p>
-      <w:pPr>
-        <w:pStyle w:val="Default"/>
-        <w:rPr>
-          <w:lang w:val="ro-RO"/>
-        </w:rPr>
-      </w:pPr>
-    </w:p>
-    <w:p>
-      <w:pPr>
-        <w:pStyle w:val="Default"/>
-        <w:rPr>
-          <w:lang w:val="ro-RO"/>
-        </w:rPr>
-      </w:pPr>
-    </w:p>
-    <w:p>
-      <w:pPr>
-        <w:pStyle w:val="Default"/>
-        <w:rPr>
-          <w:lang w:val="ro-RO"/>
-        </w:rPr>
-      </w:pPr>
-    </w:p>
-    <w:p>
-      <w:pPr>
-        <w:pStyle w:val="Default"/>
-        <w:rPr>
-          <w:lang w:val="ro-RO"/>
-        </w:rPr>
-      </w:pPr>
-    </w:p>
-    <w:p>
-      <w:pPr>
-        <w:pStyle w:val="Heading1"/>
-        <w:numPr>
-          <w:ilvl w:val="0"/>
-          <w:numId w:val="0"/>
-        </w:numPr>
-      </w:pPr>
-      <w:r>
-        <w:br w:type="page"/>
-      </w:r>
-      <w:bookmarkStart w:id="42" w:name="_Toc226026653"/>
-      <w:r>
-        <w:lastRenderedPageBreak/>
-        <w:t>Index</w:t>
-      </w:r>
-      <w:bookmarkEnd w:id="42"/>
-    </w:p>
-    <w:p>
-      <w:pPr>
-        <w:rPr>
-          <w:noProof/>
-          <w:sz w:val="20"/>
-        </w:rPr>
-        <w:sectPr>
-          <w:headerReference w:type="first" r:id="rId17"/>
-          <w:footerReference w:type="first" r:id="rId18"/>
-          <w:pgSz w:w="11907" w:h="16839" w:code="9"/>
-          <w:pgMar w:top="1440" w:right="1440" w:bottom="1440" w:left="1440" w:header="720" w:footer="720" w:gutter="0"/>
-          <w:cols w:space="720"/>
-          <w:titlePg/>
-          <w:docGrid w:linePitch="360"/>
-        </w:sectPr>
-      </w:pPr>
-      <w:r>
-        <w:rPr>
-          <w:sz w:val="20"/>
-        </w:rPr>
-        <w:fldChar w:fldCharType="begin"/>
-      </w:r>
-      <w:r>
-        <w:rPr>
-          <w:sz w:val="20"/>
-        </w:rPr>
-        <w:instrText xml:space="preserve"> INDEX \e "</w:instrText>
-      </w:r>
-      <w:r>
-        <w:rPr>
-          <w:sz w:val="20"/>
-        </w:rPr>
-        <w:tab/>
-        <w:instrText xml:space="preserve">" \c "2" \z "1033" </w:instrText>
-      </w:r>
-      <w:r>
-        <w:rPr>
-          <w:sz w:val="20"/>
-        </w:rPr>
-        <w:fldChar w:fldCharType="separate"/>
-      </w:r>
-    </w:p>
-    <w:p>
-      <w:pPr>
-        <w:pStyle w:val="Index1"/>
-        <w:tabs>
-          <w:tab w:val="right" w:leader="dot" w:pos="4143"/>
-        </w:tabs>
-        <w:rPr>
-          <w:noProof/>
-        </w:rPr>
-      </w:pPr>
-      <w:r>
-        <w:rPr>
-          <w:noProof/>
-        </w:rPr>
-        <w:t>Bibliografie</w:t>
-      </w:r>
-      <w:r>
-        <w:rPr>
-          <w:noProof/>
-        </w:rPr>
-        <w:tab/>
-        <w:t>14</w:t>
-      </w:r>
-    </w:p>
-    <w:p>
-      <w:pPr>
-        <w:pStyle w:val="Index1"/>
-        <w:tabs>
-          <w:tab w:val="right" w:leader="dot" w:pos="4143"/>
-        </w:tabs>
-        <w:rPr>
-          <w:noProof/>
-        </w:rPr>
-      </w:pPr>
-      <w:r>
-        <w:rPr>
-          <w:b/>
-          <w:noProof/>
-        </w:rPr>
-        <w:t>CUPRINSUL</w:t>
-      </w:r>
-      <w:r>
-        <w:rPr>
-          <w:noProof/>
-        </w:rPr>
-        <w:tab/>
-        <w:t>xii</w:t>
-      </w:r>
-    </w:p>
-    <w:p>
-      <w:pPr>
-        <w:pStyle w:val="Index1"/>
-        <w:tabs>
-          <w:tab w:val="right" w:leader="dot" w:pos="4143"/>
-        </w:tabs>
-        <w:rPr>
-          <w:noProof/>
-        </w:rPr>
-      </w:pPr>
-      <w:r>
-        <w:rPr>
-          <w:noProof/>
-        </w:rPr>
-        <w:t>Dimensiuni</w:t>
-      </w:r>
-      <w:r>
-        <w:rPr>
-          <w:noProof/>
-        </w:rPr>
-        <w:tab/>
-        <w:t>3</w:t>
-      </w:r>
-    </w:p>
-    <w:p>
-      <w:pPr>
-        <w:pStyle w:val="Index1"/>
-        <w:tabs>
-          <w:tab w:val="right" w:leader="dot" w:pos="4143"/>
-        </w:tabs>
-        <w:rPr>
-          <w:noProof/>
-        </w:rPr>
-      </w:pPr>
-      <w:r>
-        <w:rPr>
-          <w:noProof/>
-        </w:rPr>
-        <w:t>Figuri</w:t>
-      </w:r>
-      <w:r>
-        <w:rPr>
-          <w:noProof/>
-        </w:rPr>
-        <w:tab/>
-        <w:t>4</w:t>
-      </w:r>
-    </w:p>
-    <w:p>
-      <w:pPr>
-        <w:pStyle w:val="Index1"/>
-        <w:tabs>
-          <w:tab w:val="right" w:leader="dot" w:pos="4143"/>
-        </w:tabs>
-        <w:rPr>
-          <w:noProof/>
-        </w:rPr>
-      </w:pPr>
-      <w:r>
-        <w:rPr>
-          <w:noProof/>
-        </w:rPr>
-        <w:t>Formulele matematice</w:t>
-      </w:r>
-      <w:r>
-        <w:rPr>
-          <w:noProof/>
-        </w:rPr>
-        <w:tab/>
-        <w:t>4</w:t>
-      </w:r>
-    </w:p>
-    <w:p>
-      <w:pPr>
-        <w:pStyle w:val="Index1"/>
-        <w:tabs>
-          <w:tab w:val="right" w:leader="dot" w:pos="4143"/>
-        </w:tabs>
-        <w:rPr>
-          <w:noProof/>
-        </w:rPr>
-      </w:pPr>
-      <w:r>
-        <w:rPr>
-          <w:noProof/>
-        </w:rPr>
-        <w:t>Ilustrațiile</w:t>
-      </w:r>
-      <w:r>
-        <w:rPr>
-          <w:noProof/>
-        </w:rPr>
-        <w:tab/>
-        <w:t>4</w:t>
-      </w:r>
-    </w:p>
-    <w:p>
-      <w:pPr>
-        <w:pStyle w:val="Index1"/>
-        <w:tabs>
-          <w:tab w:val="right" w:leader="dot" w:pos="4143"/>
-        </w:tabs>
-        <w:rPr>
-          <w:noProof/>
-        </w:rPr>
-      </w:pPr>
-      <w:r>
-        <w:rPr>
-          <w:noProof/>
-        </w:rPr>
-        <w:t>Legenda</w:t>
-      </w:r>
-      <w:r>
-        <w:rPr>
-          <w:noProof/>
-        </w:rPr>
-        <w:tab/>
-        <w:t>6</w:t>
-      </w:r>
-    </w:p>
-    <w:p>
-      <w:pPr>
-        <w:pStyle w:val="Index1"/>
-        <w:tabs>
-          <w:tab w:val="right" w:leader="dot" w:pos="4143"/>
-        </w:tabs>
-        <w:rPr>
-          <w:noProof/>
-        </w:rPr>
-      </w:pPr>
-      <w:r>
-        <w:rPr>
-          <w:b/>
-          <w:noProof/>
-        </w:rPr>
-        <w:t>LISTA FIGURILOR</w:t>
-      </w:r>
-      <w:r>
-        <w:rPr>
-          <w:noProof/>
-        </w:rPr>
-        <w:tab/>
-        <w:t>xiv</w:t>
-      </w:r>
-    </w:p>
-    <w:p>
-      <w:pPr>
-        <w:pStyle w:val="Index1"/>
-        <w:tabs>
-          <w:tab w:val="right" w:leader="dot" w:pos="4143"/>
-        </w:tabs>
-        <w:rPr>
-          <w:noProof/>
-        </w:rPr>
-      </w:pPr>
-      <w:r>
-        <w:rPr>
-          <w:b/>
-          <w:noProof/>
-        </w:rPr>
-        <w:t>LISTA TABELELOR</w:t>
-      </w:r>
-      <w:r>
-        <w:rPr>
-          <w:noProof/>
-        </w:rPr>
-        <w:tab/>
-        <w:t>xv</w:t>
-      </w:r>
-    </w:p>
-    <w:p>
-      <w:pPr>
-        <w:pStyle w:val="Index1"/>
-        <w:tabs>
-          <w:tab w:val="right" w:leader="dot" w:pos="4143"/>
-        </w:tabs>
-        <w:rPr>
-          <w:noProof/>
-        </w:rPr>
-      </w:pPr>
-      <w:r>
-        <w:rPr>
-          <w:noProof/>
-        </w:rPr>
-        <w:t>Referințe web</w:t>
-      </w:r>
-    </w:p>
-    <w:p>
-      <w:pPr>
-        <w:pStyle w:val="Index2"/>
-        <w:tabs>
-          <w:tab w:val="right" w:leader="dot" w:pos="4143"/>
-        </w:tabs>
-        <w:rPr>
-          <w:noProof/>
-        </w:rPr>
-      </w:pPr>
-      <w:r>
-        <w:rPr>
-          <w:noProof/>
-        </w:rPr>
-        <w:t>Referințe</w:t>
-      </w:r>
-      <w:r>
-        <w:rPr>
-          <w:noProof/>
-        </w:rPr>
-        <w:tab/>
-        <w:t>15</w:t>
-      </w:r>
-    </w:p>
-    <w:p>
-      <w:pPr>
-        <w:pStyle w:val="Index1"/>
-        <w:tabs>
-          <w:tab w:val="right" w:leader="dot" w:pos="4143"/>
-        </w:tabs>
-        <w:rPr>
-          <w:noProof/>
-        </w:rPr>
-      </w:pPr>
-      <w:r>
-        <w:rPr>
-          <w:noProof/>
-        </w:rPr>
-        <w:t>Structura documentului</w:t>
-      </w:r>
-      <w:r>
-        <w:rPr>
-          <w:noProof/>
-        </w:rPr>
-        <w:tab/>
-        <w:t>2</w:t>
-      </w:r>
-    </w:p>
-    <w:p>
-      <w:pPr>
-        <w:pStyle w:val="Index1"/>
-        <w:tabs>
-          <w:tab w:val="right" w:leader="dot" w:pos="4143"/>
-        </w:tabs>
-        <w:rPr>
-          <w:noProof/>
-        </w:rPr>
-      </w:pPr>
-      <w:r>
-        <w:rPr>
-          <w:noProof/>
-        </w:rPr>
-        <w:t>Tabele</w:t>
-      </w:r>
-      <w:r>
-        <w:rPr>
-          <w:noProof/>
-        </w:rPr>
-        <w:tab/>
-        <w:t>5</w:t>
-      </w:r>
-    </w:p>
-    <w:p>
-      <w:pPr>
-        <w:rPr>
-          <w:noProof/>
-          <w:sz w:val="20"/>
-        </w:rPr>
-        <w:sectPr>
-          <w:type w:val="continuous"/>
-          <w:pgSz w:w="11907" w:h="16839" w:code="9"/>
-          <w:pgMar w:top="1440" w:right="1440" w:bottom="1440" w:left="1440" w:header="720" w:footer="720" w:gutter="0"/>
-          <w:cols w:num="2" w:space="720"/>
-          <w:titlePg/>
-          <w:docGrid w:linePitch="360"/>
-        </w:sectPr>
-      </w:pPr>
-    </w:p>
-    <w:p>
-      <w:pPr>
-        <w:rPr>
-          <w:sz w:val="20"/>
-        </w:rPr>
-      </w:pPr>
-      <w:r>
-        <w:rPr>
-          <w:sz w:val="20"/>
-        </w:rPr>
-        <w:fldChar w:fldCharType="end"/>
-      </w:r>
-    </w:p>
     <w:sectPr>
+      <w:headerReference w:type="first" r:id="rId15"/>
+      <w:footerReference w:type="first" r:id="rId16"/>
+      <w:endnotePr>
+        <w:numFmt w:val="decimal"/>
+      </w:endnotePr>
       <w:type w:val="continuous"/>
       <w:pgSz w:w="11907" w:h="16839" w:code="9"/>
       <w:pgMar w:top="1440" w:right="1440" w:bottom="1440" w:left="1440" w:header="720" w:footer="720" w:gutter="0"/>
@@ -16406,20 +15656,167 @@
       </w:r>
     </w:p>
   </w:endnote>
+  <w:endnote w:id="1">
+    <w:p>
+      <w:pPr>
+        <w:pStyle w:val="EndnoteText"/>
+      </w:pPr>
+      <w:r>
+        <w:rPr>
+          <w:rStyle w:val="EndnoteReference"/>
+        </w:rPr>
+        <w:endnoteRef/>
+      </w:r>
+      <w:r>
+        <w:t xml:space="preserve"> </w:t>
+      </w:r>
+      <w:r>
+        <w:t>Fama, E. F. (1970). Efficient Capital Markets: A Review of Theory and Empirical Work. The Journal of Finance, 25(2), 383–417.</w:t>
+      </w:r>
+    </w:p>
+  </w:endnote>
+  <w:endnote w:id="2">
+    <w:p>
+      <w:pPr>
+        <w:pStyle w:val="EndnoteText"/>
+        <w:rPr>
+          <w:lang w:val="en-US"/>
+        </w:rPr>
+      </w:pPr>
+      <w:r>
+        <w:rPr>
+          <w:rStyle w:val="EndnoteReference"/>
+        </w:rPr>
+        <w:endnoteRef/>
+      </w:r>
+      <w:r>
+        <w:t xml:space="preserve"> </w:t>
+      </w:r>
+      <w:r>
+        <w:t>Malkiel, B. G. (2019). A Random Walk Down Wall Street: The Time-Tested Strategy for Successful Investing (12th ed.). W. W. Norton &amp; Company.</w:t>
+      </w:r>
+    </w:p>
+  </w:endnote>
+  <w:endnote w:id="3">
+    <w:p>
+      <w:pPr>
+        <w:pStyle w:val="EndnoteText"/>
+        <w:rPr>
+          <w:lang w:val="en-US"/>
+        </w:rPr>
+      </w:pPr>
+      <w:r>
+        <w:rPr>
+          <w:rStyle w:val="EndnoteReference"/>
+        </w:rPr>
+        <w:endnoteRef/>
+      </w:r>
+      <w:r>
+        <w:t xml:space="preserve"> </w:t>
+      </w:r>
+      <w:r>
+        <w:t>Goodfellow, I., Bengio, Y., &amp; Courville, A. (2016). Deep Learning. MIT Press.</w:t>
+      </w:r>
+    </w:p>
+  </w:endnote>
+  <w:endnote w:id="4">
+    <w:p>
+      <w:pPr>
+        <w:pStyle w:val="EndnoteText"/>
+        <w:rPr>
+          <w:lang w:val="en-US"/>
+        </w:rPr>
+      </w:pPr>
+      <w:r>
+        <w:rPr>
+          <w:rStyle w:val="EndnoteReference"/>
+        </w:rPr>
+        <w:endnoteRef/>
+      </w:r>
+      <w:r>
+        <w:t xml:space="preserve"> </w:t>
+      </w:r>
+      <w:r>
+        <w:t xml:space="preserve"> </w:t>
+      </w:r>
+      <w:r>
+        <w:t>Berutich, J. M., de la Rosa, F. L., Caridad, J. M., &amp; Jareño, F. (2022). A VWAP-based trading strategy using deep learning techniques. Financial Innovation, 8(1), 45.</w:t>
+      </w:r>
+    </w:p>
+  </w:endnote>
+  <w:endnote w:id="5">
+    <w:p>
+      <w:pPr>
+        <w:pStyle w:val="EndnoteText"/>
+        <w:rPr>
+          <w:lang w:val="en-US"/>
+        </w:rPr>
+      </w:pPr>
+      <w:r>
+        <w:rPr>
+          <w:rStyle w:val="EndnoteReference"/>
+        </w:rPr>
+        <w:endnoteRef/>
+      </w:r>
+      <w:r>
+        <w:t xml:space="preserve"> </w:t>
+      </w:r>
+      <w:r>
+        <w:t xml:space="preserve"> </w:t>
+      </w:r>
+      <w:r>
+        <w:t>Chollet, F. (2021). Deep Learning with Python (2nd ed.). Manning Publications.</w:t>
+      </w:r>
+    </w:p>
+  </w:endnote>
+  <w:endnote w:id="6">
+    <w:p>
+      <w:pPr>
+        <w:pStyle w:val="EndnoteText"/>
+        <w:rPr>
+          <w:lang w:val="en-US"/>
+        </w:rPr>
+      </w:pPr>
+      <w:r>
+        <w:rPr>
+          <w:rStyle w:val="EndnoteReference"/>
+        </w:rPr>
+        <w:endnoteRef/>
+      </w:r>
+      <w:r>
+        <w:t xml:space="preserve"> </w:t>
+      </w:r>
+      <w:r>
+        <w:t>McKinney, W. (2022). Python for Data Analysis: Data Wrangling with pandas, NumPy, and Jupyter (3rd ed.). O'Reilly Media.</w:t>
+      </w:r>
+    </w:p>
+  </w:endnote>
+  <w:endnote w:id="7">
+    <w:p>
+      <w:pPr>
+        <w:pStyle w:val="EndnoteText"/>
+        <w:rPr>
+          <w:lang w:val="en-US"/>
+        </w:rPr>
+      </w:pPr>
+      <w:r>
+        <w:rPr>
+          <w:rStyle w:val="EndnoteReference"/>
+        </w:rPr>
+        <w:endnoteRef/>
+      </w:r>
+      <w:r>
+        <w:t xml:space="preserve"> </w:t>
+      </w:r>
+      <w:r>
+        <w:t>Yahoo Finance API. (2026). Historical Market Data Reference Endpoint. https://query1.finance.yahoo.com</w:t>
+      </w:r>
+    </w:p>
+  </w:endnote>
 </w:endnotes>
 </file>
 
 <file path=word/footer1.xml><?xml version="1.0" encoding="utf-8"?>
-<w:ftr xmlns:wpc="http://schemas.microsoft.com/office/word/2010/wordprocessingCanvas" xmlns:cx="http://schemas.microsoft.com/office/drawing/2014/chartex" xmlns:cx1="http://schemas.microsoft.com/office/drawing/2015/9/8/chartex" xmlns:cx2="http://schemas.microsoft.com/office/drawing/2015/10/21/chartex" xmlns:cx3="http://schemas.microsoft.com/office/drawing/2016/5/9/chartex" xmlns:cx4="http://schemas.microsoft.com/office/drawing/2016/5/10/chartex" xmlns:cx5="http://schemas.microsoft.com/office/drawing/2016/5/11/chartex" xmlns:cx6="http://schemas.microsoft.com/office/drawing/2016/5/12/chartex" xmlns:cx7="http://schemas.microsoft.com/office/drawing/2016/5/13/chartex" xmlns:cx8="http://schemas.microsoft.com/office/drawing/2016/5/14/chartex" xmlns:mc="http://schemas.openxmlformats.org/markup-compatibility/2006" xmlns:aink="http://schemas.microsoft.com/office/drawing/2016/ink" xmlns:am3d="http://schemas.microsoft.com/office/drawing/2017/model3d" xmlns:o="urn:schemas-microsoft-com:office:office" xmlns:oel="http://schemas.microsoft.com/office/2019/extlst" xmlns:r="http://schemas.openxmlformats.org/officeDocument/2006/relationships" xmlns:m="http://schemas.openxmlformats.org/officeDocument/2006/math" xmlns:v="urn:schemas-microsoft-com:vml" xmlns:wp14="http://schemas.microsoft.com/office/word/2010/wordprocessingDrawing" xmlns:wp="http://schemas.openxmlformats.org/drawingml/2006/wordprocessingDrawing" xmlns:w10="urn:schemas-microsoft-com:office:word" xmlns:w="http://schemas.openxmlformats.org/wordprocessingml/2006/main" xmlns:w14="http://schemas.microsoft.com/office/word/2010/wordml" xmlns:w15="http://schemas.microsoft.com/office/word/2012/wordml" xmlns:w16cex="http://schemas.microsoft.com/office/word/2018/wordml/cex" xmlns:w16cid="http://schemas.microsoft.com/office/word/2016/wordml/cid" xmlns:w16="http://schemas.microsoft.com/office/word/2018/wordml" xmlns:w16du="http://schemas.microsoft.com/office/word/2023/wordml/word16du" xmlns:w16sdtdh="http://schemas.microsoft.com/office/word/2020/wordml/sdtdatahash" xmlns:w16sdtfl="http://schemas.microsoft.com/office/word/2024/wordml/sdtformatlock" xmlns:w16se="http://schemas.microsoft.com/office/word/2015/wordml/symex" xmlns:wpg="http://schemas.microsoft.com/office/word/2010/wordprocessingGroup" xmlns:wpi="http://schemas.microsoft.com/office/word/2010/wordprocessingInk" xmlns:wne="http://schemas.microsoft.com/office/word/2006/wordml" xmlns:wps="http://schemas.microsoft.com/office/word/2010/wordprocessingShape" mc:Ignorable="w14 w15 w16se w16cid w16 w16cex w16sdtdh w16sdtfl w16du wp14">
-  <w:p>
-    <w:pPr>
-      <w:pStyle w:val="Footer"/>
-    </w:pPr>
-  </w:p>
-</w:ftr>
-</file>
-
-<file path=word/footer2.xml><?xml version="1.0" encoding="utf-8"?>
 <w:ftr xmlns:wpc="http://schemas.microsoft.com/office/word/2010/wordprocessingCanvas" xmlns:cx="http://schemas.microsoft.com/office/drawing/2014/chartex" xmlns:cx1="http://schemas.microsoft.com/office/drawing/2015/9/8/chartex" xmlns:cx2="http://schemas.microsoft.com/office/drawing/2015/10/21/chartex" xmlns:cx3="http://schemas.microsoft.com/office/drawing/2016/5/9/chartex" xmlns:cx4="http://schemas.microsoft.com/office/drawing/2016/5/10/chartex" xmlns:cx5="http://schemas.microsoft.com/office/drawing/2016/5/11/chartex" xmlns:cx6="http://schemas.microsoft.com/office/drawing/2016/5/12/chartex" xmlns:cx7="http://schemas.microsoft.com/office/drawing/2016/5/13/chartex" xmlns:cx8="http://schemas.microsoft.com/office/drawing/2016/5/14/chartex" xmlns:mc="http://schemas.openxmlformats.org/markup-compatibility/2006" xmlns:aink="http://schemas.microsoft.com/office/drawing/2016/ink" xmlns:am3d="http://schemas.microsoft.com/office/drawing/2017/model3d" xmlns:o="urn:schemas-microsoft-com:office:office" xmlns:oel="http://schemas.microsoft.com/office/2019/extlst" xmlns:r="http://schemas.openxmlformats.org/officeDocument/2006/relationships" xmlns:m="http://schemas.openxmlformats.org/officeDocument/2006/math" xmlns:v="urn:schemas-microsoft-com:vml" xmlns:wp14="http://schemas.microsoft.com/office/word/2010/wordprocessingDrawing" xmlns:wp="http://schemas.openxmlformats.org/drawingml/2006/wordprocessingDrawing" xmlns:w10="urn:schemas-microsoft-com:office:word" xmlns:w="http://schemas.openxmlformats.org/wordprocessingml/2006/main" xmlns:w14="http://schemas.microsoft.com/office/word/2010/wordml" xmlns:w15="http://schemas.microsoft.com/office/word/2012/wordml" xmlns:w16cex="http://schemas.microsoft.com/office/word/2018/wordml/cex" xmlns:w16cid="http://schemas.microsoft.com/office/word/2016/wordml/cid" xmlns:w16="http://schemas.microsoft.com/office/word/2018/wordml" xmlns:w16du="http://schemas.microsoft.com/office/word/2023/wordml/word16du" xmlns:w16sdtdh="http://schemas.microsoft.com/office/word/2020/wordml/sdtdatahash" xmlns:w16sdtfl="http://schemas.microsoft.com/office/word/2024/wordml/sdtformatlock" xmlns:w16se="http://schemas.microsoft.com/office/word/2015/wordml/symex" xmlns:wpg="http://schemas.microsoft.com/office/word/2010/wordprocessingGroup" xmlns:wpi="http://schemas.microsoft.com/office/word/2010/wordprocessingInk" xmlns:wne="http://schemas.microsoft.com/office/word/2006/wordml" xmlns:wps="http://schemas.microsoft.com/office/word/2010/wordprocessingShape" mc:Ignorable="w14 w15 w16se w16cid w16 w16cex w16sdtdh w16sdtfl w16du wp14">
   <w:p>
     <w:pPr>
@@ -16456,7 +15853,7 @@
 </w:ftr>
 </file>
 
-<file path=word/footer3.xml><?xml version="1.0" encoding="utf-8"?>
+<file path=word/footer2.xml><?xml version="1.0" encoding="utf-8"?>
 <w:ftr xmlns:wpc="http://schemas.microsoft.com/office/word/2010/wordprocessingCanvas" xmlns:cx="http://schemas.microsoft.com/office/drawing/2014/chartex" xmlns:cx1="http://schemas.microsoft.com/office/drawing/2015/9/8/chartex" xmlns:cx2="http://schemas.microsoft.com/office/drawing/2015/10/21/chartex" xmlns:cx3="http://schemas.microsoft.com/office/drawing/2016/5/9/chartex" xmlns:cx4="http://schemas.microsoft.com/office/drawing/2016/5/10/chartex" xmlns:cx5="http://schemas.microsoft.com/office/drawing/2016/5/11/chartex" xmlns:cx6="http://schemas.microsoft.com/office/drawing/2016/5/12/chartex" xmlns:cx7="http://schemas.microsoft.com/office/drawing/2016/5/13/chartex" xmlns:cx8="http://schemas.microsoft.com/office/drawing/2016/5/14/chartex" xmlns:mc="http://schemas.openxmlformats.org/markup-compatibility/2006" xmlns:aink="http://schemas.microsoft.com/office/drawing/2016/ink" xmlns:am3d="http://schemas.microsoft.com/office/drawing/2017/model3d" xmlns:o="urn:schemas-microsoft-com:office:office" xmlns:oel="http://schemas.microsoft.com/office/2019/extlst" xmlns:r="http://schemas.openxmlformats.org/officeDocument/2006/relationships" xmlns:m="http://schemas.openxmlformats.org/officeDocument/2006/math" xmlns:v="urn:schemas-microsoft-com:vml" xmlns:wp14="http://schemas.microsoft.com/office/word/2010/wordprocessingDrawing" xmlns:wp="http://schemas.openxmlformats.org/drawingml/2006/wordprocessingDrawing" xmlns:w10="urn:schemas-microsoft-com:office:word" xmlns:w="http://schemas.openxmlformats.org/wordprocessingml/2006/main" xmlns:w14="http://schemas.microsoft.com/office/word/2010/wordml" xmlns:w15="http://schemas.microsoft.com/office/word/2012/wordml" xmlns:w16cex="http://schemas.microsoft.com/office/word/2018/wordml/cex" xmlns:w16cid="http://schemas.microsoft.com/office/word/2016/wordml/cid" xmlns:w16="http://schemas.microsoft.com/office/word/2018/wordml" xmlns:w16du="http://schemas.microsoft.com/office/word/2023/wordml/word16du" xmlns:w16sdtdh="http://schemas.microsoft.com/office/word/2020/wordml/sdtdatahash" xmlns:w16sdtfl="http://schemas.microsoft.com/office/word/2024/wordml/sdtformatlock" xmlns:w16se="http://schemas.microsoft.com/office/word/2015/wordml/symex" xmlns:wpg="http://schemas.microsoft.com/office/word/2010/wordprocessingGroup" xmlns:wpi="http://schemas.microsoft.com/office/word/2010/wordprocessingInk" xmlns:wne="http://schemas.microsoft.com/office/word/2006/wordml" xmlns:wps="http://schemas.microsoft.com/office/word/2010/wordprocessingShape" mc:Ignorable="w14 w15 w16se w16cid w16 w16cex w16sdtdh w16sdtfl w16du wp14">
   <w:p>
     <w:pPr>
@@ -16472,7 +15869,7 @@
 </w:ftr>
 </file>
 
-<file path=word/footer4.xml><?xml version="1.0" encoding="utf-8"?>
+<file path=word/footer3.xml><?xml version="1.0" encoding="utf-8"?>
 <w:ftr xmlns:wpc="http://schemas.microsoft.com/office/word/2010/wordprocessingCanvas" xmlns:cx="http://schemas.microsoft.com/office/drawing/2014/chartex" xmlns:cx1="http://schemas.microsoft.com/office/drawing/2015/9/8/chartex" xmlns:cx2="http://schemas.microsoft.com/office/drawing/2015/10/21/chartex" xmlns:cx3="http://schemas.microsoft.com/office/drawing/2016/5/9/chartex" xmlns:cx4="http://schemas.microsoft.com/office/drawing/2016/5/10/chartex" xmlns:cx5="http://schemas.microsoft.com/office/drawing/2016/5/11/chartex" xmlns:cx6="http://schemas.microsoft.com/office/drawing/2016/5/12/chartex" xmlns:cx7="http://schemas.microsoft.com/office/drawing/2016/5/13/chartex" xmlns:cx8="http://schemas.microsoft.com/office/drawing/2016/5/14/chartex" xmlns:mc="http://schemas.openxmlformats.org/markup-compatibility/2006" xmlns:aink="http://schemas.microsoft.com/office/drawing/2016/ink" xmlns:am3d="http://schemas.microsoft.com/office/drawing/2017/model3d" xmlns:o="urn:schemas-microsoft-com:office:office" xmlns:oel="http://schemas.microsoft.com/office/2019/extlst" xmlns:r="http://schemas.openxmlformats.org/officeDocument/2006/relationships" xmlns:m="http://schemas.openxmlformats.org/officeDocument/2006/math" xmlns:v="urn:schemas-microsoft-com:vml" xmlns:wp14="http://schemas.microsoft.com/office/word/2010/wordprocessingDrawing" xmlns:wp="http://schemas.openxmlformats.org/drawingml/2006/wordprocessingDrawing" xmlns:w10="urn:schemas-microsoft-com:office:word" xmlns:w="http://schemas.openxmlformats.org/wordprocessingml/2006/main" xmlns:w14="http://schemas.microsoft.com/office/word/2010/wordml" xmlns:w15="http://schemas.microsoft.com/office/word/2012/wordml" xmlns:w16cex="http://schemas.microsoft.com/office/word/2018/wordml/cex" xmlns:w16cid="http://schemas.microsoft.com/office/word/2016/wordml/cid" xmlns:w16="http://schemas.microsoft.com/office/word/2018/wordml" xmlns:w16du="http://schemas.microsoft.com/office/word/2023/wordml/word16du" xmlns:w16sdtdh="http://schemas.microsoft.com/office/word/2020/wordml/sdtdatahash" xmlns:w16sdtfl="http://schemas.microsoft.com/office/word/2024/wordml/sdtformatlock" xmlns:w16se="http://schemas.microsoft.com/office/word/2015/wordml/symex" xmlns:wpg="http://schemas.microsoft.com/office/word/2010/wordprocessingGroup" xmlns:wpi="http://schemas.microsoft.com/office/word/2010/wordprocessingInk" xmlns:wne="http://schemas.microsoft.com/office/word/2006/wordml" xmlns:wps="http://schemas.microsoft.com/office/word/2010/wordprocessingShape" mc:Ignorable="w14 w15 w16se w16cid w16 w16cex w16sdtdh w16sdtfl w16du wp14">
   <w:p>
     <w:pPr>
@@ -20283,6 +19680,9 @@
   <w:num w:numId="38" w16cid:durableId="1937669199">
     <w:abstractNumId w:val="5"/>
   </w:num>
+  <w:num w:numId="39" w16cid:durableId="1484278510">
+    <w:abstractNumId w:val="24"/>
+  </w:num>
 </w:numbering>
 </file>
 
@@ -20292,7 +19692,7 @@
     <w:rPrDefault>
       <w:rPr>
         <w:rFonts w:ascii="Times New Roman" w:eastAsia="Calibri" w:hAnsi="Times New Roman" w:cs="Calibri"/>
-        <w:lang w:val="en-RO" w:eastAsia="en-GB" w:bidi="ar-SA"/>
+        <w:lang w:val="en-US" w:eastAsia="en-US" w:bidi="ar-SA"/>
       </w:rPr>
     </w:rPrDefault>
     <w:pPrDefault/>
@@ -20684,7 +20084,7 @@
     </w:pPr>
     <w:rPr>
       <w:sz w:val="22"/>
-      <w:lang w:val="ro-RO" w:eastAsia="en-US"/>
+      <w:lang w:val="ro-RO"/>
     </w:rPr>
   </w:style>
   <w:style w:type="paragraph" w:styleId="Heading1">
@@ -20907,6 +20307,7 @@
   <w:style w:type="character" w:default="1" w:styleId="DefaultParagraphFont">
     <w:name w:val="Default Paragraph Font"/>
     <w:uiPriority w:val="1"/>
+    <w:semiHidden/>
     <w:unhideWhenUsed/>
   </w:style>
   <w:style w:type="table" w:default="1" w:styleId="TableNormal">
@@ -21372,7 +20773,6 @@
       <w:color w:val="000000"/>
       <w:sz w:val="24"/>
       <w:szCs w:val="24"/>
-      <w:lang w:val="en-US" w:eastAsia="en-US"/>
     </w:rPr>
   </w:style>
   <w:style w:type="paragraph" w:styleId="HTMLPreformatted">
@@ -21717,13 +21117,45 @@
       <w:rFonts w:eastAsia="Times New Roman" w:cs="Times New Roman"/>
       <w:sz w:val="24"/>
       <w:szCs w:val="24"/>
-      <w:lang w:val="en-RO" w:eastAsia="en-GB"/>
+      <w:lang w:eastAsia="en-GB"/>
     </w:rPr>
   </w:style>
   <w:style w:type="character" w:customStyle="1" w:styleId="math-inline">
     <w:name w:val="math-inline"/>
     <w:basedOn w:val="DefaultParagraphFont"/>
     <w:rsid w:val="00E17E93"/>
+  </w:style>
+  <w:style w:type="paragraph" w:styleId="EndnoteText">
+    <w:name w:val="endnote text"/>
+    <w:basedOn w:val="Normal"/>
+    <w:link w:val="EndnoteTextChar"/>
+    <w:uiPriority w:val="99"/>
+    <w:semiHidden/>
+    <w:unhideWhenUsed/>
+    <w:rsid w:val="00275F30"/>
+    <w:rPr>
+      <w:sz w:val="20"/>
+    </w:rPr>
+  </w:style>
+  <w:style w:type="character" w:customStyle="1" w:styleId="EndnoteTextChar">
+    <w:name w:val="Endnote Text Char"/>
+    <w:link w:val="EndnoteText"/>
+    <w:uiPriority w:val="99"/>
+    <w:semiHidden/>
+    <w:rsid w:val="00275F30"/>
+    <w:rPr>
+      <w:lang w:val="ro-RO" w:eastAsia="en-US"/>
+    </w:rPr>
+  </w:style>
+  <w:style w:type="character" w:styleId="EndnoteReference">
+    <w:name w:val="endnote reference"/>
+    <w:uiPriority w:val="99"/>
+    <w:semiHidden/>
+    <w:unhideWhenUsed/>
+    <w:rsid w:val="00275F30"/>
+    <w:rPr>
+      <w:vertAlign w:val="superscript"/>
+    </w:rPr>
   </w:style>
 </w:styles>
 </file>

</xml_diff>